<commit_message>
Update Bible study notes content for multiple languages for 2026-06-23 release
</commit_message>
<xml_diff>
--- a/ind/docx/35.content.docx
+++ b/ind/docx/35.content.docx
@@ -527,6 +527,4126 @@
           <w:lang w:val="id_ID" w:bidi="id_ID"/>
         </w:rPr>
         <w:t>, "Latar").</w:t>
+      </w:r>
+      <w:r>
+        <w:rPr>
+          <w:lang w:val="id_ID" w:bidi="id_ID"/>
+        </w:rPr>
+      </w:r>
+      <w:r>
+        <w:rPr>
+          <w:lang w:val="id_ID" w:bidi="id_ID"/>
+        </w:rPr>
+      </w:r>
+    </w:p>
+    <w:p>
+      <w:pPr/>
+      <w:r>
+        <w:rPr>
+          <w:lang w:val="id_ID" w:bidi="id_ID"/>
+        </w:rPr>
+      </w:r>
+    </w:p>
+    <w:p>
+      <w:pPr>
+        <w:pStyle w:val="Heading2"/>
+      </w:pPr>
+      <w:r>
+        <w:rPr>
+          <w:lang w:val="id_ID" w:bidi="id_ID"/>
+        </w:rPr>
+        <w:t>Habakuk 1:4</w:t>
+      </w:r>
+      <w:r>
+        <w:rPr>
+          <w:lang w:val="id_ID" w:bidi="id_ID"/>
+        </w:rPr>
+      </w:r>
+    </w:p>
+    <w:p>
+      <w:pPr/>
+      <w:r>
+        <w:rPr>
+          <w:lang w:val="id_ID" w:bidi="id_ID"/>
+        </w:rPr>
+      </w:r>
+      <w:r>
+        <w:rPr>
+          <w:lang w:val="id_ID" w:bidi="id_ID"/>
+        </w:rPr>
+        <w:t xml:space="preserve">Habakuk menyampaikan keprihatinannya mengenai ketidakadilan dan ketidakbenaran yang ia saksikan di sekelilingnya (lihat Hab. </w:t>
+      </w:r>
+      <w:hyperlink r:id="rId20">
+        <w:r>
+          <w:rPr>
+            <w:lang w:val="id_ID" w:bidi="id_ID"/>
+          </w:rPr>
+          <w:rPr>
+            <w:color w:val="0000EE"/>
+            <w:u w:val="single"/>
+          </w:rPr>
+          <w:t>1:12–13</w:t>
+        </w:r>
+      </w:hyperlink>
+      <w:r>
+        <w:rPr>
+          <w:lang w:val="id_ID" w:bidi="id_ID"/>
+        </w:rPr>
+        <w:t xml:space="preserve">; </w:t>
+      </w:r>
+      <w:hyperlink r:id="rId21">
+        <w:r>
+          <w:rPr>
+            <w:lang w:val="id_ID" w:bidi="id_ID"/>
+          </w:rPr>
+          <w:rPr>
+            <w:color w:val="0000EE"/>
+            <w:u w:val="single"/>
+          </w:rPr>
+          <w:t>2:4</w:t>
+        </w:r>
+      </w:hyperlink>
+      <w:r>
+        <w:rPr>
+          <w:lang w:val="id_ID" w:bidi="id_ID"/>
+        </w:rPr>
+        <w:t xml:space="preserve">, </w:t>
+      </w:r>
+      <w:hyperlink r:id="rId22">
+        <w:r>
+          <w:rPr>
+            <w:lang w:val="id_ID" w:bidi="id_ID"/>
+          </w:rPr>
+          <w:rPr>
+            <w:color w:val="0000EE"/>
+            <w:u w:val="single"/>
+          </w:rPr>
+          <w:t>9</w:t>
+        </w:r>
+      </w:hyperlink>
+      <w:r>
+        <w:rPr>
+          <w:lang w:val="id_ID" w:bidi="id_ID"/>
+        </w:rPr>
+        <w:t>), bahkan di pengadilan, di mana hukum tidak lagi berfungsi dalam menegakkan keadilan.</w:t>
+      </w:r>
+      <w:r>
+        <w:rPr>
+          <w:lang w:val="id_ID" w:bidi="id_ID"/>
+        </w:rPr>
+      </w:r>
+      <w:r>
+        <w:rPr>
+          <w:lang w:val="id_ID" w:bidi="id_ID"/>
+        </w:rPr>
+      </w:r>
+    </w:p>
+    <w:p>
+      <w:pPr/>
+      <w:r>
+        <w:rPr>
+          <w:lang w:val="id_ID" w:bidi="id_ID"/>
+        </w:rPr>
+      </w:r>
+    </w:p>
+    <w:p>
+      <w:pPr>
+        <w:pStyle w:val="Heading2"/>
+      </w:pPr>
+      <w:r>
+        <w:rPr>
+          <w:lang w:val="id_ID" w:bidi="id_ID"/>
+        </w:rPr>
+        <w:t>Habakuk 1:5</w:t>
+      </w:r>
+      <w:r>
+        <w:rPr>
+          <w:lang w:val="id_ID" w:bidi="id_ID"/>
+        </w:rPr>
+      </w:r>
+    </w:p>
+    <w:p>
+      <w:pPr/>
+      <w:r>
+        <w:rPr>
+          <w:lang w:val="id_ID" w:bidi="id_ID"/>
+        </w:rPr>
+      </w:r>
+      <w:r>
+        <w:rPr>
+          <w:lang w:val="id_ID" w:bidi="id_ID"/>
+        </w:rPr>
+        <w:t xml:space="preserve">Lihatlah . . . perhatikanlah: Dua kata kerja Ibrani yang berbeda, keduanya diterjemahkan sebagai </w:t>
+      </w:r>
+      <w:r>
+        <w:rPr>
+          <w:i/>
+          <w:lang w:val="id_ID" w:bidi="id_ID"/>
+        </w:rPr>
+        <w:t xml:space="preserve">lihatlah dan perhatikanlah </w:t>
+      </w:r>
+      <w:r>
+        <w:rPr>
+          <w:lang w:val="id_ID" w:bidi="id_ID"/>
+        </w:rPr>
+        <w:t xml:space="preserve">dalam </w:t>
+      </w:r>
+      <w:hyperlink r:id="rId23">
+        <w:r>
+          <w:rPr>
+            <w:lang w:val="id_ID" w:bidi="id_ID"/>
+          </w:rPr>
+          <w:rPr>
+            <w:color w:val="0000EE"/>
+            <w:u w:val="single"/>
+          </w:rPr>
+          <w:t>Hab. 1:3</w:t>
+        </w:r>
+      </w:hyperlink>
+      <w:r>
+        <w:rPr>
+          <w:lang w:val="id_ID" w:bidi="id_ID"/>
+        </w:rPr>
+        <w:t xml:space="preserve">. Ini membentuk hubungan sastra antara pertanyaan Habakuk dalam </w:t>
+      </w:r>
+      <w:hyperlink r:id="rId23">
+        <w:r>
+          <w:rPr>
+            <w:lang w:val="id_ID" w:bidi="id_ID"/>
+          </w:rPr>
+          <w:rPr>
+            <w:color w:val="0000EE"/>
+            <w:u w:val="single"/>
+          </w:rPr>
+          <w:t>Hab.1:3</w:t>
+        </w:r>
+      </w:hyperlink>
+      <w:r>
+        <w:rPr>
+          <w:lang w:val="id_ID" w:bidi="id_ID"/>
+        </w:rPr>
+        <w:t xml:space="preserve"> dengan jawaban Allah dalam </w:t>
+      </w:r>
+      <w:hyperlink r:id="rId24">
+        <w:r>
+          <w:rPr>
+            <w:lang w:val="id_ID" w:bidi="id_ID"/>
+          </w:rPr>
+          <w:rPr>
+            <w:color w:val="0000EE"/>
+            <w:u w:val="single"/>
+          </w:rPr>
+          <w:t>Hab. 1:5–11</w:t>
+        </w:r>
+      </w:hyperlink>
+      <w:r>
+        <w:rPr>
+          <w:lang w:val="id_ID" w:bidi="id_ID"/>
+        </w:rPr>
+        <w:t>.</w:t>
+      </w:r>
+    </w:p>
+    <w:p>
+      <w:pPr/>
+      <w:r>
+        <w:rPr>
+          <w:lang w:val="id_ID" w:bidi="id_ID"/>
+        </w:rPr>
+      </w:r>
+      <w:r>
+        <w:rPr>
+          <w:lang w:val="id_ID" w:bidi="id_ID"/>
+        </w:rPr>
+      </w:r>
+      <w:r>
+        <w:rPr>
+          <w:lang w:val="id_ID" w:bidi="id_ID"/>
+        </w:rPr>
+      </w:r>
+    </w:p>
+    <w:p>
+      <w:pPr/>
+      <w:r>
+        <w:rPr>
+          <w:lang w:val="id_ID" w:bidi="id_ID"/>
+        </w:rPr>
+      </w:r>
+    </w:p>
+    <w:p>
+      <w:pPr>
+        <w:pStyle w:val="Heading2"/>
+      </w:pPr>
+      <w:r>
+        <w:rPr>
+          <w:lang w:val="id_ID" w:bidi="id_ID"/>
+        </w:rPr>
+        <w:t>Habakuk 1:5–11</w:t>
+      </w:r>
+      <w:r>
+        <w:rPr>
+          <w:lang w:val="id_ID" w:bidi="id_ID"/>
+        </w:rPr>
+      </w:r>
+    </w:p>
+    <w:p>
+      <w:pPr/>
+      <w:r>
+        <w:rPr>
+          <w:lang w:val="id_ID" w:bidi="id_ID"/>
+        </w:rPr>
+      </w:r>
+      <w:r>
+        <w:rPr>
+          <w:lang w:val="id_ID" w:bidi="id_ID"/>
+        </w:rPr>
+        <w:t>Jawaban Allah terhadap pertanyaan Habakuk sangat mengejutkan. Allah akan mengirim satu bangsa yang kejam, yaitu bangsa Babel, untuk membereskan kekerasan di Yehuda. Tentara Babel, yang terlatih dengan baik dan berpengalaman dalam pertempuran, adalah suatu kekuatan yang tak terhentikan.</w:t>
+      </w:r>
+      <w:r>
+        <w:rPr>
+          <w:lang w:val="id_ID" w:bidi="id_ID"/>
+        </w:rPr>
+      </w:r>
+      <w:r>
+        <w:rPr>
+          <w:lang w:val="id_ID" w:bidi="id_ID"/>
+        </w:rPr>
+      </w:r>
+    </w:p>
+    <w:p>
+      <w:pPr/>
+      <w:r>
+        <w:rPr>
+          <w:lang w:val="id_ID" w:bidi="id_ID"/>
+        </w:rPr>
+      </w:r>
+    </w:p>
+    <w:p>
+      <w:pPr>
+        <w:pStyle w:val="Heading2"/>
+      </w:pPr>
+      <w:r>
+        <w:rPr>
+          <w:lang w:val="id_ID" w:bidi="id_ID"/>
+        </w:rPr>
+        <w:t>Habakuk 1:7</w:t>
+      </w:r>
+      <w:r>
+        <w:rPr>
+          <w:lang w:val="id_ID" w:bidi="id_ID"/>
+        </w:rPr>
+      </w:r>
+    </w:p>
+    <w:p>
+      <w:pPr/>
+      <w:r>
+        <w:rPr>
+          <w:lang w:val="id_ID" w:bidi="id_ID"/>
+        </w:rPr>
+      </w:r>
+      <w:r>
+        <w:rPr>
+          <w:lang w:val="id_ID" w:bidi="id_ID"/>
+        </w:rPr>
+        <w:t>berasal dari padanya sendiri: Tidak ada kelepasan dari ketidakadilan yang akan dilakukan orang-orang Babel, karena mereka menentukan hukum bagi diri mereka sendiri. Hal ini menambah kebingungan nabi terhadap keputusan Allah untuk memakai mereka untuk menghukum Yehuda.</w:t>
+      </w:r>
+      <w:r>
+        <w:rPr>
+          <w:lang w:val="id_ID" w:bidi="id_ID"/>
+        </w:rPr>
+      </w:r>
+      <w:r>
+        <w:rPr>
+          <w:lang w:val="id_ID" w:bidi="id_ID"/>
+        </w:rPr>
+      </w:r>
+    </w:p>
+    <w:p>
+      <w:pPr/>
+      <w:r>
+        <w:rPr>
+          <w:lang w:val="id_ID" w:bidi="id_ID"/>
+        </w:rPr>
+      </w:r>
+    </w:p>
+    <w:p>
+      <w:pPr>
+        <w:pStyle w:val="Heading2"/>
+      </w:pPr>
+      <w:r>
+        <w:rPr>
+          <w:lang w:val="id_ID" w:bidi="id_ID"/>
+        </w:rPr>
+        <w:t>Habakuk 1:8</w:t>
+      </w:r>
+      <w:r>
+        <w:rPr>
+          <w:lang w:val="id_ID" w:bidi="id_ID"/>
+        </w:rPr>
+      </w:r>
+    </w:p>
+    <w:p>
+      <w:pPr/>
+      <w:r>
+        <w:rPr>
+          <w:lang w:val="id_ID" w:bidi="id_ID"/>
+        </w:rPr>
+      </w:r>
+      <w:r>
+        <w:rPr>
+          <w:lang w:val="id_ID" w:bidi="id_ID"/>
+        </w:rPr>
+        <w:t>Gambaran-gambaran tentang macan tutul</w:t>
+      </w:r>
+      <w:r>
+        <w:rPr>
+          <w:i/>
+          <w:lang w:val="id_ID" w:bidi="id_ID"/>
+        </w:rPr>
+        <w:t>,</w:t>
+      </w:r>
+      <w:r>
+        <w:rPr>
+          <w:lang w:val="id_ID" w:bidi="id_ID"/>
+        </w:rPr>
+        <w:t xml:space="preserve"> serigala</w:t>
+      </w:r>
+      <w:r>
+        <w:rPr>
+          <w:i/>
+          <w:lang w:val="id_ID" w:bidi="id_ID"/>
+        </w:rPr>
+        <w:t>,</w:t>
+      </w:r>
+      <w:r>
+        <w:rPr>
+          <w:lang w:val="id_ID" w:bidi="id_ID"/>
+        </w:rPr>
+        <w:t xml:space="preserve"> dan rajawali menggambarkan kecepatan, keganasan, dan sifat pemangsa dari serangan bangsa Babel terhadap Yehuda (lihat </w:t>
+      </w:r>
+      <w:hyperlink r:id="rId25">
+        <w:r>
+          <w:rPr>
+            <w:lang w:val="id_ID" w:bidi="id_ID"/>
+          </w:rPr>
+          <w:rPr>
+            <w:color w:val="0000EE"/>
+            <w:u w:val="single"/>
+          </w:rPr>
+          <w:t>Yer. 4:13</w:t>
+        </w:r>
+      </w:hyperlink>
+      <w:r>
+        <w:rPr>
+          <w:lang w:val="id_ID" w:bidi="id_ID"/>
+        </w:rPr>
+        <w:t xml:space="preserve">; </w:t>
+      </w:r>
+      <w:hyperlink r:id="rId26">
+        <w:r>
+          <w:rPr>
+            <w:lang w:val="id_ID" w:bidi="id_ID"/>
+          </w:rPr>
+          <w:rPr>
+            <w:color w:val="0000EE"/>
+            <w:u w:val="single"/>
+          </w:rPr>
+          <w:t>48:40</w:t>
+        </w:r>
+      </w:hyperlink>
+      <w:r>
+        <w:rPr>
+          <w:lang w:val="id_ID" w:bidi="id_ID"/>
+        </w:rPr>
+        <w:t xml:space="preserve">; </w:t>
+      </w:r>
+      <w:hyperlink r:id="rId27">
+        <w:r>
+          <w:rPr>
+            <w:lang w:val="id_ID" w:bidi="id_ID"/>
+          </w:rPr>
+          <w:rPr>
+            <w:color w:val="0000EE"/>
+            <w:u w:val="single"/>
+          </w:rPr>
+          <w:t>49:22</w:t>
+        </w:r>
+      </w:hyperlink>
+      <w:r>
+        <w:rPr>
+          <w:lang w:val="id_ID" w:bidi="id_ID"/>
+        </w:rPr>
+        <w:t>).</w:t>
+      </w:r>
+      <w:r>
+        <w:rPr>
+          <w:lang w:val="id_ID" w:bidi="id_ID"/>
+        </w:rPr>
+      </w:r>
+      <w:r>
+        <w:rPr>
+          <w:lang w:val="id_ID" w:bidi="id_ID"/>
+        </w:rPr>
+      </w:r>
+    </w:p>
+    <w:p>
+      <w:pPr/>
+      <w:r>
+        <w:rPr>
+          <w:lang w:val="id_ID" w:bidi="id_ID"/>
+        </w:rPr>
+      </w:r>
+    </w:p>
+    <w:p>
+      <w:pPr>
+        <w:pStyle w:val="Heading2"/>
+      </w:pPr>
+      <w:r>
+        <w:rPr>
+          <w:lang w:val="id_ID" w:bidi="id_ID"/>
+        </w:rPr>
+        <w:t>Habakuk 1:9</w:t>
+      </w:r>
+      <w:r>
+        <w:rPr>
+          <w:lang w:val="id_ID" w:bidi="id_ID"/>
+        </w:rPr>
+      </w:r>
+    </w:p>
+    <w:p>
+      <w:pPr/>
+      <w:r>
+        <w:rPr>
+          <w:lang w:val="id_ID" w:bidi="id_ID"/>
+        </w:rPr>
+      </w:r>
+      <w:r>
+        <w:rPr>
+          <w:lang w:val="id_ID" w:bidi="id_ID"/>
+        </w:rPr>
+        <w:t xml:space="preserve">Orang-orang Babel memang membawa banyak tawanan dari Yehuda ke pembuangan antara tahun 605 dan 586 SM (lihat </w:t>
+      </w:r>
+      <w:hyperlink r:id="rId28">
+        <w:r>
+          <w:rPr>
+            <w:lang w:val="id_ID" w:bidi="id_ID"/>
+          </w:rPr>
+          <w:rPr>
+            <w:color w:val="0000EE"/>
+            <w:u w:val="single"/>
+          </w:rPr>
+          <w:t>Dan. 1:1–3</w:t>
+        </w:r>
+      </w:hyperlink>
+      <w:r>
+        <w:rPr>
+          <w:lang w:val="id_ID" w:bidi="id_ID"/>
+        </w:rPr>
+        <w:t>).</w:t>
+      </w:r>
+      <w:r>
+        <w:rPr>
+          <w:lang w:val="id_ID" w:bidi="id_ID"/>
+        </w:rPr>
+      </w:r>
+      <w:r>
+        <w:rPr>
+          <w:lang w:val="id_ID" w:bidi="id_ID"/>
+        </w:rPr>
+      </w:r>
+    </w:p>
+    <w:p>
+      <w:pPr/>
+      <w:r>
+        <w:rPr>
+          <w:lang w:val="id_ID" w:bidi="id_ID"/>
+        </w:rPr>
+      </w:r>
+    </w:p>
+    <w:p>
+      <w:pPr>
+        <w:pStyle w:val="Heading2"/>
+      </w:pPr>
+      <w:r>
+        <w:rPr>
+          <w:lang w:val="id_ID" w:bidi="id_ID"/>
+        </w:rPr>
+        <w:t>Habakuk 1:10</w:t>
+      </w:r>
+      <w:r>
+        <w:rPr>
+          <w:lang w:val="id_ID" w:bidi="id_ID"/>
+        </w:rPr>
+      </w:r>
+    </w:p>
+    <w:p>
+      <w:pPr/>
+      <w:r>
+        <w:rPr>
+          <w:lang w:val="id_ID" w:bidi="id_ID"/>
+        </w:rPr>
+      </w:r>
+      <w:r>
+        <w:rPr>
+          <w:lang w:val="id_ID" w:bidi="id_ID"/>
+        </w:rPr>
+        <w:t xml:space="preserve">Taktik pertempuran kuno berupa pembangunan tempat berkubu yang menempel pada tembok-tembok kota telah banyak dibuktikan di Timur Dekat kuno (misalnya, </w:t>
+      </w:r>
+      <w:hyperlink r:id="rId29">
+        <w:r>
+          <w:rPr>
+            <w:lang w:val="id_ID" w:bidi="id_ID"/>
+          </w:rPr>
+          <w:rPr>
+            <w:color w:val="0000EE"/>
+            <w:u w:val="single"/>
+          </w:rPr>
+          <w:t>2Raj. 19:32</w:t>
+        </w:r>
+      </w:hyperlink>
+      <w:r>
+        <w:rPr>
+          <w:lang w:val="id_ID" w:bidi="id_ID"/>
+        </w:rPr>
+        <w:t xml:space="preserve">; </w:t>
+      </w:r>
+      <w:hyperlink r:id="rId30">
+        <w:r>
+          <w:rPr>
+            <w:lang w:val="id_ID" w:bidi="id_ID"/>
+          </w:rPr>
+          <w:rPr>
+            <w:color w:val="0000EE"/>
+            <w:u w:val="single"/>
+          </w:rPr>
+          <w:t>Nah. 2:1</w:t>
+        </w:r>
+      </w:hyperlink>
+      <w:r>
+        <w:rPr>
+          <w:lang w:val="id_ID" w:bidi="id_ID"/>
+        </w:rPr>
+        <w:t>).</w:t>
+      </w:r>
+      <w:r>
+        <w:rPr>
+          <w:lang w:val="id_ID" w:bidi="id_ID"/>
+        </w:rPr>
+      </w:r>
+      <w:r>
+        <w:rPr>
+          <w:lang w:val="id_ID" w:bidi="id_ID"/>
+        </w:rPr>
+      </w:r>
+    </w:p>
+    <w:p>
+      <w:pPr/>
+      <w:r>
+        <w:rPr>
+          <w:lang w:val="id_ID" w:bidi="id_ID"/>
+        </w:rPr>
+      </w:r>
+    </w:p>
+    <w:p>
+      <w:pPr>
+        <w:pStyle w:val="Heading2"/>
+      </w:pPr>
+      <w:r>
+        <w:rPr>
+          <w:lang w:val="id_ID" w:bidi="id_ID"/>
+        </w:rPr>
+        <w:t>Habakuk 1:11</w:t>
+      </w:r>
+      <w:r>
+        <w:rPr>
+          <w:lang w:val="id_ID" w:bidi="id_ID"/>
+        </w:rPr>
+      </w:r>
+    </w:p>
+    <w:p>
+      <w:pPr/>
+      <w:r>
+        <w:rPr>
+          <w:lang w:val="id_ID" w:bidi="id_ID"/>
+        </w:rPr>
+      </w:r>
+      <w:r>
+        <w:rPr>
+          <w:lang w:val="id_ID" w:bidi="id_ID"/>
+        </w:rPr>
+        <w:t>dengan mendewakan kekuatannya: Bangsa Babel menyembah banyak ilah palsu. Keyakinan mereka yang angkuh karena mengandalkan kekuatan militer mereka menjadi suatu berhala lagi bagi mereka.</w:t>
+      </w:r>
+      <w:r>
+        <w:rPr>
+          <w:lang w:val="id_ID" w:bidi="id_ID"/>
+        </w:rPr>
+      </w:r>
+      <w:r>
+        <w:rPr>
+          <w:lang w:val="id_ID" w:bidi="id_ID"/>
+        </w:rPr>
+      </w:r>
+    </w:p>
+    <w:p>
+      <w:pPr/>
+      <w:r>
+        <w:rPr>
+          <w:lang w:val="id_ID" w:bidi="id_ID"/>
+        </w:rPr>
+      </w:r>
+    </w:p>
+    <w:p>
+      <w:pPr>
+        <w:pStyle w:val="Heading2"/>
+      </w:pPr>
+      <w:r>
+        <w:rPr>
+          <w:lang w:val="id_ID" w:bidi="id_ID"/>
+        </w:rPr>
+        <w:t>Habakuk 1:12</w:t>
+      </w:r>
+      <w:r>
+        <w:rPr>
+          <w:lang w:val="id_ID" w:bidi="id_ID"/>
+        </w:rPr>
+      </w:r>
+    </w:p>
+    <w:p>
+      <w:pPr/>
+      <w:r>
+        <w:rPr>
+          <w:lang w:val="id_ID" w:bidi="id_ID"/>
+        </w:rPr>
+      </w:r>
+      <w:r>
+        <w:rPr>
+          <w:lang w:val="id_ID" w:bidi="id_ID"/>
+        </w:rPr>
+        <w:t>Meskipun dalam kebingungan, Habakuk tidak meninggalkan Allah. Dengan kata-kata "Allahku, Yang Mahakudus</w:t>
+      </w:r>
+      <w:r>
+        <w:rPr>
+          <w:i/>
+          <w:lang w:val="id_ID" w:bidi="id_ID"/>
+        </w:rPr>
+        <w:t>,"</w:t>
+      </w:r>
+      <w:r>
+        <w:rPr>
+          <w:lang w:val="id_ID" w:bidi="id_ID"/>
+        </w:rPr>
+        <w:t xml:space="preserve"> ia menegaskan kembali komitmennya kepada Tuhan sebelum mengajukan pertanyaan serius tentang apa yang telah Allah ungkapkan kepadanya. • Mengingat karakter Allah dan hubungan perjanjian dengan Israel, Habakuk yakin bahwa Allah tidak akan memusnahkan umat-Nya. • untuk menghukumkan: Bandingkan </w:t>
+      </w:r>
+      <w:hyperlink r:id="rId31">
+        <w:r>
+          <w:rPr>
+            <w:lang w:val="id_ID" w:bidi="id_ID"/>
+          </w:rPr>
+          <w:rPr>
+            <w:color w:val="0000EE"/>
+            <w:u w:val="single"/>
+          </w:rPr>
+          <w:t>Ibr. 12:5–11</w:t>
+        </w:r>
+      </w:hyperlink>
+      <w:r>
+        <w:rPr>
+          <w:lang w:val="id_ID" w:bidi="id_ID"/>
+        </w:rPr>
+        <w:t xml:space="preserve">. • ya Gunung Batu: Gambaran umum tentang kesetiaan dan kekuatan Allah (lihat </w:t>
+      </w:r>
+      <w:hyperlink r:id="rId32">
+        <w:r>
+          <w:rPr>
+            <w:lang w:val="id_ID" w:bidi="id_ID"/>
+          </w:rPr>
+          <w:rPr>
+            <w:color w:val="0000EE"/>
+            <w:u w:val="single"/>
+          </w:rPr>
+          <w:t>Ul. 32:15</w:t>
+        </w:r>
+      </w:hyperlink>
+      <w:r>
+        <w:rPr>
+          <w:lang w:val="id_ID" w:bidi="id_ID"/>
+        </w:rPr>
+        <w:t xml:space="preserve">; </w:t>
+      </w:r>
+      <w:hyperlink r:id="rId33">
+        <w:r>
+          <w:rPr>
+            <w:lang w:val="id_ID" w:bidi="id_ID"/>
+          </w:rPr>
+          <w:rPr>
+            <w:color w:val="0000EE"/>
+            <w:u w:val="single"/>
+          </w:rPr>
+          <w:t>1Sam. 2:2</w:t>
+        </w:r>
+      </w:hyperlink>
+      <w:r>
+        <w:rPr>
+          <w:lang w:val="id_ID" w:bidi="id_ID"/>
+        </w:rPr>
+        <w:t xml:space="preserve">; </w:t>
+      </w:r>
+      <w:hyperlink r:id="rId34">
+        <w:r>
+          <w:rPr>
+            <w:lang w:val="id_ID" w:bidi="id_ID"/>
+          </w:rPr>
+          <w:rPr>
+            <w:color w:val="0000EE"/>
+            <w:u w:val="single"/>
+          </w:rPr>
+          <w:t>Mzm. 18:2</w:t>
+        </w:r>
+      </w:hyperlink>
+      <w:r>
+        <w:rPr>
+          <w:lang w:val="id_ID" w:bidi="id_ID"/>
+        </w:rPr>
+        <w:t xml:space="preserve">; </w:t>
+      </w:r>
+      <w:hyperlink r:id="rId35">
+        <w:r>
+          <w:rPr>
+            <w:lang w:val="id_ID" w:bidi="id_ID"/>
+          </w:rPr>
+          <w:rPr>
+            <w:color w:val="0000EE"/>
+            <w:u w:val="single"/>
+          </w:rPr>
+          <w:t>1Kor. 10:4</w:t>
+        </w:r>
+      </w:hyperlink>
+      <w:r>
+        <w:rPr>
+          <w:lang w:val="id_ID" w:bidi="id_ID"/>
+        </w:rPr>
+        <w:t xml:space="preserve">; </w:t>
+      </w:r>
+      <w:hyperlink r:id="rId36">
+        <w:r>
+          <w:rPr>
+            <w:lang w:val="id_ID" w:bidi="id_ID"/>
+          </w:rPr>
+          <w:rPr>
+            <w:color w:val="0000EE"/>
+            <w:u w:val="single"/>
+          </w:rPr>
+          <w:t>1Ptr. 2:6–8</w:t>
+        </w:r>
+      </w:hyperlink>
+      <w:r>
+        <w:rPr>
+          <w:lang w:val="id_ID" w:bidi="id_ID"/>
+        </w:rPr>
+        <w:t>).</w:t>
+      </w:r>
+      <w:r>
+        <w:rPr>
+          <w:lang w:val="id_ID" w:bidi="id_ID"/>
+        </w:rPr>
+      </w:r>
+      <w:r>
+        <w:rPr>
+          <w:lang w:val="id_ID" w:bidi="id_ID"/>
+        </w:rPr>
+      </w:r>
+    </w:p>
+    <w:p>
+      <w:pPr/>
+      <w:r>
+        <w:rPr>
+          <w:lang w:val="id_ID" w:bidi="id_ID"/>
+        </w:rPr>
+      </w:r>
+    </w:p>
+    <w:p>
+      <w:pPr>
+        <w:pStyle w:val="Heading2"/>
+      </w:pPr>
+      <w:r>
+        <w:rPr>
+          <w:lang w:val="id_ID" w:bidi="id_ID"/>
+        </w:rPr>
+        <w:t>Habakuk 1:12–2.1</w:t>
+      </w:r>
+      <w:r>
+        <w:rPr>
+          <w:lang w:val="id_ID" w:bidi="id_ID"/>
+        </w:rPr>
+      </w:r>
+    </w:p>
+    <w:p>
+      <w:pPr/>
+      <w:r>
+        <w:rPr>
+          <w:lang w:val="id_ID" w:bidi="id_ID"/>
+        </w:rPr>
+      </w:r>
+      <w:r>
+        <w:rPr>
+          <w:lang w:val="id_ID" w:bidi="id_ID"/>
+        </w:rPr>
+        <w:t>Habakuk merasa kesulitan untuk menyelaraskan jawaban Allah (</w:t>
+      </w:r>
+      <w:hyperlink r:id="rId24">
+        <w:r>
+          <w:rPr>
+            <w:lang w:val="id_ID" w:bidi="id_ID"/>
+          </w:rPr>
+          <w:rPr>
+            <w:color w:val="0000EE"/>
+            <w:u w:val="single"/>
+          </w:rPr>
+          <w:t>Hab.</w:t>
+        </w:r>
+      </w:hyperlink>
+      <w:r>
+        <w:rPr>
+          <w:lang w:val="id_ID" w:bidi="id_ID"/>
+        </w:rPr>
+        <w:t xml:space="preserve"> </w:t>
+      </w:r>
+      <w:hyperlink r:id="rId24">
+        <w:r>
+          <w:rPr>
+            <w:lang w:val="id_ID" w:bidi="id_ID"/>
+          </w:rPr>
+          <w:rPr>
+            <w:color w:val="0000EE"/>
+            <w:u w:val="single"/>
+          </w:rPr>
+          <w:t>1:5–11</w:t>
+        </w:r>
+      </w:hyperlink>
+      <w:r>
+        <w:rPr>
+          <w:lang w:val="id_ID" w:bidi="id_ID"/>
+        </w:rPr>
+        <w:t>) dengan pemahamannya sendiri tentang karakter Allah. Bagaimana mungkin Allah yang suci dan adil menghukum Yehuda dengan menggunakan orang-orang yang tidak lebih benar daripada mereka?</w:t>
+      </w:r>
+      <w:r>
+        <w:rPr>
+          <w:lang w:val="id_ID" w:bidi="id_ID"/>
+        </w:rPr>
+      </w:r>
+      <w:r>
+        <w:rPr>
+          <w:lang w:val="id_ID" w:bidi="id_ID"/>
+        </w:rPr>
+      </w:r>
+    </w:p>
+    <w:p>
+      <w:pPr/>
+      <w:r>
+        <w:rPr>
+          <w:lang w:val="id_ID" w:bidi="id_ID"/>
+        </w:rPr>
+      </w:r>
+    </w:p>
+    <w:p>
+      <w:pPr>
+        <w:pStyle w:val="Heading2"/>
+      </w:pPr>
+      <w:r>
+        <w:rPr>
+          <w:lang w:val="id_ID" w:bidi="id_ID"/>
+        </w:rPr>
+        <w:t>Habakuk 1:14–15</w:t>
+      </w:r>
+      <w:r>
+        <w:rPr>
+          <w:lang w:val="id_ID" w:bidi="id_ID"/>
+        </w:rPr>
+      </w:r>
+    </w:p>
+    <w:p>
+      <w:pPr/>
+      <w:r>
+        <w:rPr>
+          <w:lang w:val="id_ID" w:bidi="id_ID"/>
+        </w:rPr>
+      </w:r>
+      <w:r>
+        <w:rPr>
+          <w:lang w:val="id_ID" w:bidi="id_ID"/>
+        </w:rPr>
+        <w:t>Ikan … kail … pukat: Habakuk menggambarkan bangsa Babel seperti nelayan-nelayan yang sedang menarik orang-orang yang mereka taklukkan.</w:t>
+      </w:r>
+      <w:r>
+        <w:rPr>
+          <w:lang w:val="id_ID" w:bidi="id_ID"/>
+        </w:rPr>
+      </w:r>
+      <w:r>
+        <w:rPr>
+          <w:lang w:val="id_ID" w:bidi="id_ID"/>
+        </w:rPr>
+      </w:r>
+    </w:p>
+    <w:p>
+      <w:pPr/>
+      <w:r>
+        <w:rPr>
+          <w:lang w:val="id_ID" w:bidi="id_ID"/>
+        </w:rPr>
+      </w:r>
+    </w:p>
+    <w:p>
+      <w:pPr>
+        <w:pStyle w:val="Heading2"/>
+      </w:pPr>
+      <w:r>
+        <w:rPr>
+          <w:lang w:val="id_ID" w:bidi="id_ID"/>
+        </w:rPr>
+        <w:t>Habakuk 1:16</w:t>
+      </w:r>
+      <w:r>
+        <w:rPr>
+          <w:lang w:val="id_ID" w:bidi="id_ID"/>
+        </w:rPr>
+      </w:r>
+    </w:p>
+    <w:p>
+      <w:pPr/>
+      <w:r>
+        <w:rPr>
+          <w:lang w:val="id_ID" w:bidi="id_ID"/>
+        </w:rPr>
+      </w:r>
+      <w:r>
+        <w:rPr>
+          <w:lang w:val="id_ID" w:bidi="id_ID"/>
+        </w:rPr>
+        <w:t xml:space="preserve">Lihat </w:t>
+      </w:r>
+      <w:r>
+        <w:rPr>
+          <w:lang w:val="id_ID" w:bidi="id_ID"/>
+        </w:rPr>
+        <w:t>catatan studi Habakuk 1:11</w:t>
+      </w:r>
+      <w:r>
+        <w:rPr>
+          <w:lang w:val="id_ID" w:bidi="id_ID"/>
+        </w:rPr>
+        <w:t xml:space="preserve">; bandingkan dengan </w:t>
+      </w:r>
+      <w:hyperlink r:id="rId37">
+        <w:r>
+          <w:rPr>
+            <w:lang w:val="id_ID" w:bidi="id_ID"/>
+          </w:rPr>
+          <w:rPr>
+            <w:color w:val="0000EE"/>
+            <w:u w:val="single"/>
+          </w:rPr>
+          <w:t>1Yoh. 5:21</w:t>
+        </w:r>
+      </w:hyperlink>
+      <w:r>
+        <w:rPr>
+          <w:lang w:val="id_ID" w:bidi="id_ID"/>
+        </w:rPr>
+        <w:t>.</w:t>
+      </w:r>
+      <w:r>
+        <w:rPr>
+          <w:lang w:val="id_ID" w:bidi="id_ID"/>
+        </w:rPr>
+      </w:r>
+      <w:r>
+        <w:rPr>
+          <w:lang w:val="id_ID" w:bidi="id_ID"/>
+        </w:rPr>
+      </w:r>
+    </w:p>
+    <w:p>
+      <w:pPr/>
+      <w:r>
+        <w:rPr>
+          <w:lang w:val="id_ID" w:bidi="id_ID"/>
+        </w:rPr>
+      </w:r>
+    </w:p>
+    <w:p>
+      <w:pPr>
+        <w:pStyle w:val="Heading2"/>
+      </w:pPr>
+      <w:r>
+        <w:rPr>
+          <w:lang w:val="id_ID" w:bidi="id_ID"/>
+        </w:rPr>
+        <w:t>Habakuk 2:1</w:t>
+      </w:r>
+      <w:r>
+        <w:rPr>
+          <w:lang w:val="id_ID" w:bidi="id_ID"/>
+        </w:rPr>
+      </w:r>
+    </w:p>
+    <w:p>
+      <w:pPr/>
+      <w:r>
+        <w:rPr>
+          <w:lang w:val="id_ID" w:bidi="id_ID"/>
+        </w:rPr>
+      </w:r>
+      <w:r>
+        <w:rPr>
+          <w:lang w:val="id_ID" w:bidi="id_ID"/>
+        </w:rPr>
+        <w:t xml:space="preserve">Aku mau berdiri di tempat pengintaianku: Seperti seorang penjaga yang sedang bertugas (lihat juga </w:t>
+      </w:r>
+      <w:hyperlink r:id="rId38">
+        <w:r>
+          <w:rPr>
+            <w:lang w:val="id_ID" w:bidi="id_ID"/>
+          </w:rPr>
+          <w:rPr>
+            <w:color w:val="0000EE"/>
+            <w:u w:val="single"/>
+          </w:rPr>
+          <w:t>2Sam. 18:24–28</w:t>
+        </w:r>
+      </w:hyperlink>
+      <w:r>
+        <w:rPr>
+          <w:lang w:val="id_ID" w:bidi="id_ID"/>
+        </w:rPr>
+        <w:t xml:space="preserve">; </w:t>
+      </w:r>
+      <w:hyperlink r:id="rId39">
+        <w:r>
+          <w:rPr>
+            <w:lang w:val="id_ID" w:bidi="id_ID"/>
+          </w:rPr>
+          <w:rPr>
+            <w:color w:val="0000EE"/>
+            <w:u w:val="single"/>
+          </w:rPr>
+          <w:t>2Raj. 9:17–20</w:t>
+        </w:r>
+      </w:hyperlink>
+      <w:r>
+        <w:rPr>
+          <w:lang w:val="id_ID" w:bidi="id_ID"/>
+        </w:rPr>
+        <w:t xml:space="preserve">; </w:t>
+      </w:r>
+      <w:hyperlink r:id="rId40">
+        <w:r>
+          <w:rPr>
+            <w:lang w:val="id_ID" w:bidi="id_ID"/>
+          </w:rPr>
+          <w:rPr>
+            <w:color w:val="0000EE"/>
+            <w:u w:val="single"/>
+          </w:rPr>
+          <w:t>Yeh. 33:2–6</w:t>
+        </w:r>
+      </w:hyperlink>
+      <w:r>
+        <w:rPr>
+          <w:lang w:val="id_ID" w:bidi="id_ID"/>
+        </w:rPr>
+        <w:t>), Habakuk menunggu dengan pengharapan untuk melihat bagaimana Allah akan menjawab keluhannya, meskipun jika harus berupa teguran dari Tuhan.</w:t>
+      </w:r>
+      <w:r>
+        <w:rPr>
+          <w:lang w:val="id_ID" w:bidi="id_ID"/>
+        </w:rPr>
+      </w:r>
+      <w:r>
+        <w:rPr>
+          <w:lang w:val="id_ID" w:bidi="id_ID"/>
+        </w:rPr>
+      </w:r>
+    </w:p>
+    <w:p>
+      <w:pPr/>
+      <w:r>
+        <w:rPr>
+          <w:lang w:val="id_ID" w:bidi="id_ID"/>
+        </w:rPr>
+      </w:r>
+    </w:p>
+    <w:p>
+      <w:pPr>
+        <w:pStyle w:val="Heading2"/>
+      </w:pPr>
+      <w:r>
+        <w:rPr>
+          <w:lang w:val="id_ID" w:bidi="id_ID"/>
+        </w:rPr>
+        <w:t>Habakuk 2:2</w:t>
+      </w:r>
+      <w:r>
+        <w:rPr>
+          <w:lang w:val="id_ID" w:bidi="id_ID"/>
+        </w:rPr>
+      </w:r>
+    </w:p>
+    <w:p>
+      <w:pPr/>
+      <w:r>
+        <w:rPr>
+          <w:lang w:val="id_ID" w:bidi="id_ID"/>
+        </w:rPr>
+      </w:r>
+      <w:r>
+        <w:rPr>
+          <w:lang w:val="id_ID" w:bidi="id_ID"/>
+        </w:rPr>
+        <w:t xml:space="preserve">Allah memerintahkan nabi Habakuk untuk menulis pesan (secara harfiah </w:t>
+      </w:r>
+      <w:r>
+        <w:rPr>
+          <w:i/>
+          <w:lang w:val="id_ID" w:bidi="id_ID"/>
+        </w:rPr>
+        <w:t>penglihatan</w:t>
+      </w:r>
+      <w:r>
+        <w:rPr>
+          <w:lang w:val="id_ID" w:bidi="id_ID"/>
+        </w:rPr>
+        <w:t>) dengan jelas agar dapat dipahami, dipelihara, dan dibagikan kepada orang lain.</w:t>
+      </w:r>
+      <w:r>
+        <w:rPr>
+          <w:lang w:val="id_ID" w:bidi="id_ID"/>
+        </w:rPr>
+      </w:r>
+      <w:r>
+        <w:rPr>
+          <w:lang w:val="id_ID" w:bidi="id_ID"/>
+        </w:rPr>
+      </w:r>
+    </w:p>
+    <w:p>
+      <w:pPr/>
+      <w:r>
+        <w:rPr>
+          <w:lang w:val="id_ID" w:bidi="id_ID"/>
+        </w:rPr>
+      </w:r>
+    </w:p>
+    <w:p>
+      <w:pPr>
+        <w:pStyle w:val="Heading2"/>
+      </w:pPr>
+      <w:r>
+        <w:rPr>
+          <w:lang w:val="id_ID" w:bidi="id_ID"/>
+        </w:rPr>
+        <w:t>Habakuk 2:2–5</w:t>
+      </w:r>
+      <w:r>
+        <w:rPr>
+          <w:lang w:val="id_ID" w:bidi="id_ID"/>
+        </w:rPr>
+      </w:r>
+    </w:p>
+    <w:p>
+      <w:pPr/>
+      <w:r>
+        <w:rPr>
+          <w:lang w:val="id_ID" w:bidi="id_ID"/>
+        </w:rPr>
+      </w:r>
+      <w:r>
+        <w:rPr>
+          <w:lang w:val="id_ID" w:bidi="id_ID"/>
+        </w:rPr>
+        <w:t>Misi Habakuk adalah untuk menjelaskan kepada umat bahwa meskipun keadilan Allah tampaknya lambat datang</w:t>
+      </w:r>
+      <w:r>
+        <w:rPr>
+          <w:i/>
+          <w:lang w:val="id_ID" w:bidi="id_ID"/>
+        </w:rPr>
+        <w:t>,</w:t>
+      </w:r>
+      <w:r>
+        <w:rPr>
+          <w:lang w:val="id_ID" w:bidi="id_ID"/>
+        </w:rPr>
+        <w:t xml:space="preserve"> keadilan itu pasti akan datang.</w:t>
+      </w:r>
+      <w:r>
+        <w:rPr>
+          <w:lang w:val="id_ID" w:bidi="id_ID"/>
+        </w:rPr>
+      </w:r>
+      <w:r>
+        <w:rPr>
+          <w:lang w:val="id_ID" w:bidi="id_ID"/>
+        </w:rPr>
+      </w:r>
+    </w:p>
+    <w:p>
+      <w:pPr/>
+      <w:r>
+        <w:rPr>
+          <w:lang w:val="id_ID" w:bidi="id_ID"/>
+        </w:rPr>
+      </w:r>
+    </w:p>
+    <w:p>
+      <w:pPr>
+        <w:pStyle w:val="Heading2"/>
+      </w:pPr>
+      <w:r>
+        <w:rPr>
+          <w:lang w:val="id_ID" w:bidi="id_ID"/>
+        </w:rPr>
+        <w:t>Habakuk 2:2–20</w:t>
+      </w:r>
+      <w:r>
+        <w:rPr>
+          <w:lang w:val="id_ID" w:bidi="id_ID"/>
+        </w:rPr>
+      </w:r>
+    </w:p>
+    <w:p>
+      <w:pPr/>
+      <w:r>
+        <w:rPr>
+          <w:lang w:val="id_ID" w:bidi="id_ID"/>
+        </w:rPr>
+      </w:r>
+      <w:r>
+        <w:rPr>
+          <w:lang w:val="id_ID" w:bidi="id_ID"/>
+        </w:rPr>
+        <w:t>Allah menanggapi keluhan yang kedua dari Habakuk (</w:t>
+      </w:r>
+      <w:hyperlink r:id="rId41">
+        <w:r>
+          <w:rPr>
+            <w:lang w:val="id_ID" w:bidi="id_ID"/>
+          </w:rPr>
+          <w:rPr>
+            <w:color w:val="0000EE"/>
+            <w:u w:val="single"/>
+          </w:rPr>
+          <w:t>Hab.</w:t>
+        </w:r>
+      </w:hyperlink>
+      <w:r>
+        <w:rPr>
+          <w:lang w:val="id_ID" w:bidi="id_ID"/>
+        </w:rPr>
+        <w:t xml:space="preserve"> </w:t>
+      </w:r>
+      <w:hyperlink r:id="rId41">
+        <w:r>
+          <w:rPr>
+            <w:lang w:val="id_ID" w:bidi="id_ID"/>
+          </w:rPr>
+          <w:rPr>
+            <w:color w:val="0000EE"/>
+            <w:u w:val="single"/>
+          </w:rPr>
+          <w:t>1:12–2:1</w:t>
+        </w:r>
+      </w:hyperlink>
+      <w:r>
+        <w:rPr>
+          <w:lang w:val="id_ID" w:bidi="id_ID"/>
+        </w:rPr>
+        <w:t>) tanpa menjelaskan mengapa Dia memilih untuk menggunakan bangsa Babel. Sebaliknya, Dia meyakinkan Habakuk bahwa semua kekerasan dan ketidakadilan akan mendapatkan hukuman.</w:t>
+      </w:r>
+      <w:r>
+        <w:rPr>
+          <w:lang w:val="id_ID" w:bidi="id_ID"/>
+        </w:rPr>
+      </w:r>
+      <w:r>
+        <w:rPr>
+          <w:lang w:val="id_ID" w:bidi="id_ID"/>
+        </w:rPr>
+      </w:r>
+    </w:p>
+    <w:p>
+      <w:pPr/>
+      <w:r>
+        <w:rPr>
+          <w:lang w:val="id_ID" w:bidi="id_ID"/>
+        </w:rPr>
+      </w:r>
+    </w:p>
+    <w:p>
+      <w:pPr>
+        <w:pStyle w:val="Heading2"/>
+      </w:pPr>
+      <w:r>
+        <w:rPr>
+          <w:lang w:val="id_ID" w:bidi="id_ID"/>
+        </w:rPr>
+        <w:t>Habakuk 2:3</w:t>
+      </w:r>
+      <w:r>
+        <w:rPr>
+          <w:lang w:val="id_ID" w:bidi="id_ID"/>
+        </w:rPr>
+      </w:r>
+    </w:p>
+    <w:p>
+      <w:pPr/>
+      <w:r>
+        <w:rPr>
+          <w:lang w:val="id_ID" w:bidi="id_ID"/>
+        </w:rPr>
+      </w:r>
+      <w:r>
+        <w:rPr>
+          <w:lang w:val="id_ID" w:bidi="id_ID"/>
+        </w:rPr>
+        <w:t>sungguh-sungguh akan datang: Pada waktu yang telah ditentukan di masa depan, yang hanya diketahui oleh Tuhan, Dia akan campur tangan dalam sejarah bumi dan membawanya ke akhir yang tepat, membenarkan yang benar dan menghakimi atau menghukum yang jahat. Umat Allah harus menunggu dengan sabar</w:t>
+      </w:r>
+      <w:r>
+        <w:rPr>
+          <w:i/>
+          <w:lang w:val="id_ID" w:bidi="id_ID"/>
+        </w:rPr>
+        <w:t>,</w:t>
+      </w:r>
+      <w:r>
+        <w:rPr>
+          <w:lang w:val="id_ID" w:bidi="id_ID"/>
+        </w:rPr>
+        <w:t xml:space="preserve"> </w:t>
+      </w:r>
+      <w:r>
+        <w:rPr>
+          <w:lang w:val="id_ID" w:bidi="id_ID"/>
+        </w:rPr>
+        <w:t>dengan kesadaran</w:t>
+      </w:r>
+      <w:r>
+        <w:rPr>
+          <w:lang w:val="id_ID" w:bidi="id_ID"/>
+        </w:rPr>
+        <w:t xml:space="preserve"> bahwa rencana ilahi berjalan sesuai waktunya (lihat </w:t>
+      </w:r>
+      <w:hyperlink r:id="rId42">
+        <w:r>
+          <w:rPr>
+            <w:lang w:val="id_ID" w:bidi="id_ID"/>
+          </w:rPr>
+          <w:rPr>
+            <w:color w:val="0000EE"/>
+            <w:u w:val="single"/>
+          </w:rPr>
+          <w:t>Ibr. 10:35–38</w:t>
+        </w:r>
+      </w:hyperlink>
+      <w:r>
+        <w:rPr>
+          <w:lang w:val="id_ID" w:bidi="id_ID"/>
+        </w:rPr>
+        <w:t>).</w:t>
+      </w:r>
+      <w:r>
+        <w:rPr>
+          <w:lang w:val="id_ID" w:bidi="id_ID"/>
+        </w:rPr>
+      </w:r>
+      <w:r>
+        <w:rPr>
+          <w:lang w:val="id_ID" w:bidi="id_ID"/>
+        </w:rPr>
+      </w:r>
+    </w:p>
+    <w:p>
+      <w:pPr/>
+      <w:r>
+        <w:rPr>
+          <w:lang w:val="id_ID" w:bidi="id_ID"/>
+        </w:rPr>
+      </w:r>
+    </w:p>
+    <w:p>
+      <w:pPr>
+        <w:pStyle w:val="Heading2"/>
+      </w:pPr>
+      <w:r>
+        <w:rPr>
+          <w:lang w:val="id_ID" w:bidi="id_ID"/>
+        </w:rPr>
+        <w:t>Habakuk 2:4</w:t>
+      </w:r>
+      <w:r>
+        <w:rPr>
+          <w:lang w:val="id_ID" w:bidi="id_ID"/>
+        </w:rPr>
+      </w:r>
+    </w:p>
+    <w:p>
+      <w:pPr/>
+      <w:r>
+        <w:rPr>
+          <w:lang w:val="id_ID" w:bidi="id_ID"/>
+        </w:rPr>
+      </w:r>
+      <w:r>
+        <w:rPr>
+          <w:lang w:val="id_ID" w:bidi="id_ID"/>
+        </w:rPr>
+        <w:t>Allah menyadari sifat egois pada orang-orang yang sombong. Kehidupan mereka yang menyimpang menunjukkan ketidakbenaran mereka; mereka menolak pengajaran Allah dan memuaskan keinginan mereka sendiri (</w:t>
+      </w:r>
+      <w:hyperlink r:id="rId43">
+        <w:r>
+          <w:rPr>
+            <w:lang w:val="id_ID" w:bidi="id_ID"/>
+          </w:rPr>
+          <w:rPr>
+            <w:color w:val="0000EE"/>
+            <w:u w:val="single"/>
+          </w:rPr>
+          <w:t>Ams. 12:15</w:t>
+        </w:r>
+      </w:hyperlink>
+      <w:r>
+        <w:rPr>
+          <w:lang w:val="id_ID" w:bidi="id_ID"/>
+        </w:rPr>
+        <w:t xml:space="preserve">; </w:t>
+      </w:r>
+      <w:hyperlink r:id="rId44">
+        <w:r>
+          <w:rPr>
+            <w:lang w:val="id_ID" w:bidi="id_ID"/>
+          </w:rPr>
+          <w:rPr>
+            <w:color w:val="0000EE"/>
+            <w:u w:val="single"/>
+          </w:rPr>
+          <w:t>21:8</w:t>
+        </w:r>
+      </w:hyperlink>
+      <w:r>
+        <w:rPr>
+          <w:lang w:val="id_ID" w:bidi="id_ID"/>
+        </w:rPr>
+        <w:t xml:space="preserve">, </w:t>
+      </w:r>
+      <w:hyperlink r:id="rId45">
+        <w:r>
+          <w:rPr>
+            <w:lang w:val="id_ID" w:bidi="id_ID"/>
+          </w:rPr>
+          <w:rPr>
+            <w:color w:val="0000EE"/>
+            <w:u w:val="single"/>
+          </w:rPr>
+          <w:t>29</w:t>
+        </w:r>
+      </w:hyperlink>
+      <w:r>
+        <w:rPr>
+          <w:lang w:val="id_ID" w:bidi="id_ID"/>
+        </w:rPr>
+        <w:t xml:space="preserve">; </w:t>
+      </w:r>
+      <w:hyperlink r:id="rId46">
+        <w:r>
+          <w:rPr>
+            <w:lang w:val="id_ID" w:bidi="id_ID"/>
+          </w:rPr>
+          <w:rPr>
+            <w:color w:val="0000EE"/>
+            <w:u w:val="single"/>
+          </w:rPr>
+          <w:t>29:27</w:t>
+        </w:r>
+      </w:hyperlink>
+      <w:r>
+        <w:rPr>
+          <w:lang w:val="id_ID" w:bidi="id_ID"/>
+        </w:rPr>
+        <w:t xml:space="preserve">). Sebaliknya, orang benar menikmati kedudukan hukum yang benar di hadapan Allah. Mereka menjadikan standar kebenaran Allah sebagai milik mereka dan menerapkannya dalam kehidupan mereka. • </w:t>
+      </w:r>
+      <w:r>
+        <w:rPr>
+          <w:i/>
+          <w:lang w:val="id_ID" w:bidi="id_ID"/>
+        </w:rPr>
+        <w:t>Orang yang benar</w:t>
+      </w:r>
+      <w:r>
+        <w:rPr>
+          <w:lang w:val="id_ID" w:bidi="id_ID"/>
+        </w:rPr>
+        <w:t>: Ibrani ’</w:t>
+      </w:r>
+      <w:r>
+        <w:rPr>
+          <w:i/>
+          <w:lang w:val="id_ID" w:bidi="id_ID"/>
+        </w:rPr>
+        <w:t>emunah</w:t>
+      </w:r>
+      <w:r>
+        <w:rPr>
+          <w:lang w:val="id_ID" w:bidi="id_ID"/>
+        </w:rPr>
+        <w:t>. Dalam Kejadian, akar kata Ibrani yang sama (’</w:t>
+      </w:r>
+      <w:r>
+        <w:rPr>
+          <w:i/>
+          <w:lang w:val="id_ID" w:bidi="id_ID"/>
+        </w:rPr>
+        <w:t>mn</w:t>
+      </w:r>
+      <w:r>
+        <w:rPr>
+          <w:lang w:val="id_ID" w:bidi="id_ID"/>
+        </w:rPr>
+        <w:t>) menggambarkan kepercayaan Abram kepada Allah (</w:t>
+      </w:r>
+      <w:hyperlink r:id="rId47">
+        <w:r>
+          <w:rPr>
+            <w:lang w:val="id_ID" w:bidi="id_ID"/>
+          </w:rPr>
+          <w:rPr>
+            <w:color w:val="0000EE"/>
+            <w:u w:val="single"/>
+          </w:rPr>
+          <w:t>Kej. 15:6</w:t>
+        </w:r>
+      </w:hyperlink>
+      <w:r>
+        <w:rPr>
+          <w:lang w:val="id_ID" w:bidi="id_ID"/>
+        </w:rPr>
+        <w:t xml:space="preserve">). Allah mengubah hati orang yang mempercayai-Nya sehingga mereka dapat dengan setia mengikuti standar Allah yang suci. Lihat juga </w:t>
+      </w:r>
+      <w:hyperlink r:id="rId48">
+        <w:r>
+          <w:rPr>
+            <w:lang w:val="id_ID" w:bidi="id_ID"/>
+          </w:rPr>
+          <w:rPr>
+            <w:color w:val="0000EE"/>
+            <w:u w:val="single"/>
+          </w:rPr>
+          <w:t>Rm. 1:16–17</w:t>
+        </w:r>
+      </w:hyperlink>
+      <w:r>
+        <w:rPr>
+          <w:lang w:val="id_ID" w:bidi="id_ID"/>
+        </w:rPr>
+        <w:t xml:space="preserve">; </w:t>
+      </w:r>
+      <w:hyperlink r:id="rId49">
+        <w:r>
+          <w:rPr>
+            <w:lang w:val="id_ID" w:bidi="id_ID"/>
+          </w:rPr>
+          <w:rPr>
+            <w:color w:val="0000EE"/>
+            <w:u w:val="single"/>
+          </w:rPr>
+          <w:t>Gal. 3:11</w:t>
+        </w:r>
+      </w:hyperlink>
+      <w:r>
+        <w:rPr>
+          <w:lang w:val="id_ID" w:bidi="id_ID"/>
+        </w:rPr>
+        <w:t xml:space="preserve">; </w:t>
+      </w:r>
+      <w:hyperlink r:id="rId50">
+        <w:r>
+          <w:rPr>
+            <w:lang w:val="id_ID" w:bidi="id_ID"/>
+          </w:rPr>
+          <w:rPr>
+            <w:color w:val="0000EE"/>
+            <w:u w:val="single"/>
+          </w:rPr>
+          <w:t>Ibr. 10:37–39</w:t>
+        </w:r>
+      </w:hyperlink>
+      <w:r>
+        <w:rPr>
+          <w:lang w:val="id_ID" w:bidi="id_ID"/>
+        </w:rPr>
+        <w:t>.</w:t>
+      </w:r>
+      <w:r>
+        <w:rPr>
+          <w:lang w:val="id_ID" w:bidi="id_ID"/>
+        </w:rPr>
+      </w:r>
+      <w:r>
+        <w:rPr>
+          <w:lang w:val="id_ID" w:bidi="id_ID"/>
+        </w:rPr>
+      </w:r>
+    </w:p>
+    <w:p>
+      <w:pPr/>
+      <w:r>
+        <w:rPr>
+          <w:lang w:val="id_ID" w:bidi="id_ID"/>
+        </w:rPr>
+      </w:r>
+    </w:p>
+    <w:p>
+      <w:pPr>
+        <w:pStyle w:val="Heading2"/>
+      </w:pPr>
+      <w:r>
+        <w:rPr>
+          <w:lang w:val="id_ID" w:bidi="id_ID"/>
+        </w:rPr>
+        <w:t>Habakuk 2:6–8</w:t>
+      </w:r>
+      <w:r>
+        <w:rPr>
+          <w:lang w:val="id_ID" w:bidi="id_ID"/>
+        </w:rPr>
+      </w:r>
+    </w:p>
+    <w:p>
+      <w:pPr/>
+      <w:r>
+        <w:rPr>
+          <w:lang w:val="id_ID" w:bidi="id_ID"/>
+        </w:rPr>
+      </w:r>
+      <w:r>
+        <w:rPr>
+          <w:lang w:val="id_ID" w:bidi="id_ID"/>
+        </w:rPr>
+        <w:t xml:space="preserve">Dalam nyanyian olok-olok yang pertama dari Habakuk, ia mengecam bangsa Babel karena merampas bangsa-bangsa. • menjarah . . . menjarah: Gambaran ini mengibaratkan </w:t>
+      </w:r>
+      <w:r>
+        <w:rPr>
+          <w:lang w:val="id_ID" w:bidi="id_ID"/>
+        </w:rPr>
+        <w:t>bangsa Babel</w:t>
+      </w:r>
+      <w:r>
+        <w:rPr>
+          <w:lang w:val="id_ID" w:bidi="id_ID"/>
+        </w:rPr>
+        <w:t xml:space="preserve"> seperti pemberi hutang, yang tindakan penindasannya menyebabkan pihak yang berhutang bangkit melawan. Keserakahan dapat dengan mudah merusak tatanan rohani setiap individu atau bangsa (</w:t>
+      </w:r>
+      <w:hyperlink r:id="rId51">
+        <w:r>
+          <w:rPr>
+            <w:lang w:val="id_ID" w:bidi="id_ID"/>
+          </w:rPr>
+          <w:rPr>
+            <w:color w:val="0000EE"/>
+            <w:u w:val="single"/>
+          </w:rPr>
+          <w:t>Lukas 12:15</w:t>
+        </w:r>
+      </w:hyperlink>
+      <w:r>
+        <w:rPr>
+          <w:lang w:val="id_ID" w:bidi="id_ID"/>
+        </w:rPr>
+        <w:t xml:space="preserve">; </w:t>
+      </w:r>
+      <w:hyperlink r:id="rId52">
+        <w:r>
+          <w:rPr>
+            <w:lang w:val="id_ID" w:bidi="id_ID"/>
+          </w:rPr>
+          <w:rPr>
+            <w:color w:val="0000EE"/>
+            <w:u w:val="single"/>
+          </w:rPr>
+          <w:t>Ef. 5:3</w:t>
+        </w:r>
+      </w:hyperlink>
+      <w:r>
+        <w:rPr>
+          <w:lang w:val="id_ID" w:bidi="id_ID"/>
+        </w:rPr>
+        <w:t>).</w:t>
+      </w:r>
+      <w:r>
+        <w:rPr>
+          <w:lang w:val="id_ID" w:bidi="id_ID"/>
+        </w:rPr>
+      </w:r>
+      <w:r>
+        <w:rPr>
+          <w:lang w:val="id_ID" w:bidi="id_ID"/>
+        </w:rPr>
+      </w:r>
+    </w:p>
+    <w:p>
+      <w:pPr/>
+      <w:r>
+        <w:rPr>
+          <w:lang w:val="id_ID" w:bidi="id_ID"/>
+        </w:rPr>
+      </w:r>
+    </w:p>
+    <w:p>
+      <w:pPr>
+        <w:pStyle w:val="Heading2"/>
+      </w:pPr>
+      <w:r>
+        <w:rPr>
+          <w:lang w:val="id_ID" w:bidi="id_ID"/>
+        </w:rPr>
+        <w:t>Habakuk 2:6–20</w:t>
+      </w:r>
+      <w:r>
+        <w:rPr>
+          <w:lang w:val="id_ID" w:bidi="id_ID"/>
+        </w:rPr>
+      </w:r>
+    </w:p>
+    <w:p>
+      <w:pPr/>
+      <w:r>
+        <w:rPr>
+          <w:lang w:val="id_ID" w:bidi="id_ID"/>
+        </w:rPr>
+      </w:r>
+      <w:r>
+        <w:rPr>
+          <w:lang w:val="id_ID" w:bidi="id_ID"/>
+        </w:rPr>
+        <w:t>Lima nyanyian olok-olok (</w:t>
+      </w:r>
+      <w:hyperlink r:id="rId53">
+        <w:r>
+          <w:rPr>
+            <w:lang w:val="id_ID" w:bidi="id_ID"/>
+          </w:rPr>
+          <w:rPr>
+            <w:color w:val="0000EE"/>
+            <w:u w:val="single"/>
+          </w:rPr>
+          <w:t>Hab.</w:t>
+        </w:r>
+      </w:hyperlink>
+      <w:r>
+        <w:rPr>
+          <w:lang w:val="id_ID" w:bidi="id_ID"/>
+        </w:rPr>
+        <w:t xml:space="preserve"> </w:t>
+      </w:r>
+      <w:hyperlink r:id="rId54">
+        <w:r>
+          <w:rPr>
+            <w:lang w:val="id_ID" w:bidi="id_ID"/>
+          </w:rPr>
+          <w:rPr>
+            <w:color w:val="0000EE"/>
+            <w:u w:val="single"/>
+          </w:rPr>
+          <w:t>2:6–8</w:t>
+        </w:r>
+      </w:hyperlink>
+      <w:r>
+        <w:rPr>
+          <w:lang w:val="id_ID" w:bidi="id_ID"/>
+        </w:rPr>
+        <w:t xml:space="preserve">, </w:t>
+      </w:r>
+      <w:hyperlink r:id="rId55">
+        <w:r>
+          <w:rPr>
+            <w:lang w:val="id_ID" w:bidi="id_ID"/>
+          </w:rPr>
+          <w:rPr>
+            <w:color w:val="0000EE"/>
+            <w:u w:val="single"/>
+          </w:rPr>
+          <w:t>9–11</w:t>
+        </w:r>
+      </w:hyperlink>
+      <w:r>
+        <w:rPr>
+          <w:lang w:val="id_ID" w:bidi="id_ID"/>
+        </w:rPr>
+        <w:t xml:space="preserve">, </w:t>
+      </w:r>
+      <w:hyperlink r:id="rId56">
+        <w:r>
+          <w:rPr>
+            <w:lang w:val="id_ID" w:bidi="id_ID"/>
+          </w:rPr>
+          <w:rPr>
+            <w:color w:val="0000EE"/>
+            <w:u w:val="single"/>
+          </w:rPr>
+          <w:t>12–14</w:t>
+        </w:r>
+      </w:hyperlink>
+      <w:r>
+        <w:rPr>
+          <w:lang w:val="id_ID" w:bidi="id_ID"/>
+        </w:rPr>
+        <w:t xml:space="preserve">, </w:t>
+      </w:r>
+      <w:hyperlink r:id="rId57">
+        <w:r>
+          <w:rPr>
+            <w:lang w:val="id_ID" w:bidi="id_ID"/>
+          </w:rPr>
+          <w:rPr>
+            <w:color w:val="0000EE"/>
+            <w:u w:val="single"/>
+          </w:rPr>
+          <w:t>15–17</w:t>
+        </w:r>
+      </w:hyperlink>
+      <w:r>
+        <w:rPr>
+          <w:lang w:val="id_ID" w:bidi="id_ID"/>
+        </w:rPr>
+        <w:t xml:space="preserve">, </w:t>
+      </w:r>
+      <w:hyperlink r:id="rId53">
+        <w:r>
+          <w:rPr>
+            <w:lang w:val="id_ID" w:bidi="id_ID"/>
+          </w:rPr>
+          <w:rPr>
+            <w:color w:val="0000EE"/>
+            <w:u w:val="single"/>
+          </w:rPr>
+          <w:t>18–20</w:t>
+        </w:r>
+      </w:hyperlink>
+      <w:r>
+        <w:rPr>
+          <w:lang w:val="id_ID" w:bidi="id_ID"/>
+        </w:rPr>
+        <w:t xml:space="preserve">) menggambarkan penghakiman Allah di masa depan terhadap </w:t>
+      </w:r>
+      <w:r>
+        <w:rPr>
+          <w:lang w:val="id_ID" w:bidi="id_ID"/>
+        </w:rPr>
+        <w:t>bangsa Babel</w:t>
+      </w:r>
+      <w:r>
+        <w:rPr>
+          <w:lang w:val="id_ID" w:bidi="id_ID"/>
+        </w:rPr>
+        <w:t xml:space="preserve"> (dan orang-orang lain yang, seperti orang Babel, terlibat dalam kekerasan dan ketidakadilan). Allah membiarkan mereka menentukan kehancuran mereka sendiri. Mereka yang menderita akan dapat mengulangi ejekan ini ketika orang-orang jahat menghadapi penghakiman (lihat </w:t>
+      </w:r>
+      <w:hyperlink r:id="rId58">
+        <w:r>
+          <w:rPr>
+            <w:lang w:val="id_ID" w:bidi="id_ID"/>
+          </w:rPr>
+          <w:rPr>
+            <w:color w:val="0000EE"/>
+            <w:u w:val="single"/>
+          </w:rPr>
+          <w:t>Hab. 1:14–17</w:t>
+        </w:r>
+      </w:hyperlink>
+      <w:r>
+        <w:rPr>
+          <w:lang w:val="id_ID" w:bidi="id_ID"/>
+        </w:rPr>
+        <w:t>). Setiap nyanyian olok-olok ini berisi pernyataan kesedihan, penghakiman, dan alasan penghakiman Allah.</w:t>
+      </w:r>
+      <w:r>
+        <w:rPr>
+          <w:lang w:val="id_ID" w:bidi="id_ID"/>
+        </w:rPr>
+      </w:r>
+      <w:r>
+        <w:rPr>
+          <w:lang w:val="id_ID" w:bidi="id_ID"/>
+        </w:rPr>
+      </w:r>
+    </w:p>
+    <w:p>
+      <w:pPr/>
+      <w:r>
+        <w:rPr>
+          <w:lang w:val="id_ID" w:bidi="id_ID"/>
+        </w:rPr>
+      </w:r>
+    </w:p>
+    <w:p>
+      <w:pPr>
+        <w:pStyle w:val="Heading2"/>
+      </w:pPr>
+      <w:r>
+        <w:rPr>
+          <w:lang w:val="id_ID" w:bidi="id_ID"/>
+        </w:rPr>
+        <w:t>Habakuk 2:9–11</w:t>
+      </w:r>
+      <w:r>
+        <w:rPr>
+          <w:lang w:val="id_ID" w:bidi="id_ID"/>
+        </w:rPr>
+      </w:r>
+    </w:p>
+    <w:p>
+      <w:pPr/>
+      <w:r>
+        <w:rPr>
+          <w:lang w:val="id_ID" w:bidi="id_ID"/>
+        </w:rPr>
+      </w:r>
+      <w:r>
+        <w:rPr>
+          <w:lang w:val="id_ID" w:bidi="id_ID"/>
+        </w:rPr>
+        <w:t>Dalam nyanyian olok-olok yang kedua, bangsa Babel dikritik karena praktik-praktik bisnis mereka yang tidak jujur. Karena bangsa Babel menemukan cara-cara untuk membangun rumah-rumah besar melalui tipu daya dan ketidakjujuran</w:t>
+      </w:r>
+      <w:r>
+        <w:rPr>
+          <w:i/>
+          <w:lang w:val="id_ID" w:bidi="id_ID"/>
+        </w:rPr>
+        <w:t>,</w:t>
+      </w:r>
+      <w:r>
+        <w:rPr>
+          <w:lang w:val="id_ID" w:bidi="id_ID"/>
+        </w:rPr>
+        <w:t xml:space="preserve"> mereka kehilangan nyawa mereka.</w:t>
+      </w:r>
+      <w:r>
+        <w:rPr>
+          <w:lang w:val="id_ID" w:bidi="id_ID"/>
+        </w:rPr>
+      </w:r>
+      <w:r>
+        <w:rPr>
+          <w:lang w:val="id_ID" w:bidi="id_ID"/>
+        </w:rPr>
+      </w:r>
+    </w:p>
+    <w:p>
+      <w:pPr/>
+      <w:r>
+        <w:rPr>
+          <w:lang w:val="id_ID" w:bidi="id_ID"/>
+        </w:rPr>
+      </w:r>
+    </w:p>
+    <w:p>
+      <w:pPr>
+        <w:pStyle w:val="Heading2"/>
+      </w:pPr>
+      <w:r>
+        <w:rPr>
+          <w:lang w:val="id_ID" w:bidi="id_ID"/>
+        </w:rPr>
+        <w:t>Habakuk 2:12–14</w:t>
+      </w:r>
+      <w:r>
+        <w:rPr>
+          <w:lang w:val="id_ID" w:bidi="id_ID"/>
+        </w:rPr>
+      </w:r>
+    </w:p>
+    <w:p>
+      <w:pPr/>
+      <w:r>
+        <w:rPr>
+          <w:lang w:val="id_ID" w:bidi="id_ID"/>
+        </w:rPr>
+      </w:r>
+      <w:r>
+        <w:rPr>
+          <w:lang w:val="id_ID" w:bidi="id_ID"/>
+        </w:rPr>
+        <w:t>Dalam nyanyian olok-olok yang ketiga, orang-orang Babel dikutuk karena pembunuhan dan korupsi yang merusak kehidupan manusia dan masyarakat yang mendatangkan kekayaan yang mereka gunakan untuk membangun kota-kota mereka. Allah akan mengubah keuntungan yang tampak menjadi kerugian total. • Bumi akan penuh: Sebagai antitesis dari kekerasan dan kekayaan yang diperoleh secara tidak sah adalah kesadaran akan kemuliaan Tuhan, yang Allah janjikan akan menyebar seluas air di lautan (</w:t>
+      </w:r>
+      <w:hyperlink r:id="rId59">
+        <w:r>
+          <w:rPr>
+            <w:lang w:val="id_ID" w:bidi="id_ID"/>
+          </w:rPr>
+          <w:rPr>
+            <w:color w:val="0000EE"/>
+            <w:u w:val="single"/>
+          </w:rPr>
+          <w:t>Yes. 11:9</w:t>
+        </w:r>
+      </w:hyperlink>
+      <w:r>
+        <w:rPr>
+          <w:lang w:val="id_ID" w:bidi="id_ID"/>
+        </w:rPr>
+        <w:t>).</w:t>
+      </w:r>
+      <w:r>
+        <w:rPr>
+          <w:lang w:val="id_ID" w:bidi="id_ID"/>
+        </w:rPr>
+      </w:r>
+      <w:r>
+        <w:rPr>
+          <w:lang w:val="id_ID" w:bidi="id_ID"/>
+        </w:rPr>
+      </w:r>
+    </w:p>
+    <w:p>
+      <w:pPr/>
+      <w:r>
+        <w:rPr>
+          <w:lang w:val="id_ID" w:bidi="id_ID"/>
+        </w:rPr>
+      </w:r>
+    </w:p>
+    <w:p>
+      <w:pPr>
+        <w:pStyle w:val="Heading2"/>
+      </w:pPr>
+      <w:r>
+        <w:rPr>
+          <w:lang w:val="id_ID" w:bidi="id_ID"/>
+        </w:rPr>
+        <w:t>Habakuk 2:15–17</w:t>
+      </w:r>
+      <w:r>
+        <w:rPr>
+          <w:lang w:val="id_ID" w:bidi="id_ID"/>
+        </w:rPr>
+      </w:r>
+    </w:p>
+    <w:p>
+      <w:pPr/>
+      <w:r>
+        <w:rPr>
+          <w:lang w:val="id_ID" w:bidi="id_ID"/>
+        </w:rPr>
+      </w:r>
+      <w:r>
+        <w:rPr>
+          <w:lang w:val="id_ID" w:bidi="id_ID"/>
+        </w:rPr>
+        <w:t xml:space="preserve">Dalam nyanyian olok-olok yang keempat, bangsa Babel dikutuk karena tindakan mereka yang memalukan terhadap manusia, hewan, dan lingkungan. Mereka seperti seseorang yang tampaknya ramah, tetapi setelah membuat tetangganya mabuk, mereka merampas segala sesuatu dari mereka. Namun, bangsa Babel akan dipermalukan setelah minum dari cawan penghakiman Tuhan (lihat </w:t>
+      </w:r>
+      <w:hyperlink r:id="rId60">
+        <w:r>
+          <w:rPr>
+            <w:lang w:val="id_ID" w:bidi="id_ID"/>
+          </w:rPr>
+          <w:rPr>
+            <w:color w:val="0000EE"/>
+            <w:u w:val="single"/>
+          </w:rPr>
+          <w:t>Yer. 25:15–17</w:t>
+        </w:r>
+      </w:hyperlink>
+      <w:r>
+        <w:rPr>
+          <w:lang w:val="id_ID" w:bidi="id_ID"/>
+        </w:rPr>
+        <w:t xml:space="preserve">; bdk. </w:t>
+      </w:r>
+      <w:hyperlink r:id="rId61">
+        <w:r>
+          <w:rPr>
+            <w:lang w:val="id_ID" w:bidi="id_ID"/>
+          </w:rPr>
+          <w:rPr>
+            <w:color w:val="0000EE"/>
+            <w:u w:val="single"/>
+          </w:rPr>
+          <w:t>Yoh. 18:11</w:t>
+        </w:r>
+      </w:hyperlink>
+      <w:r>
+        <w:rPr>
+          <w:lang w:val="id_ID" w:bidi="id_ID"/>
+        </w:rPr>
+        <w:t>).</w:t>
+      </w:r>
+      <w:r>
+        <w:rPr>
+          <w:lang w:val="id_ID" w:bidi="id_ID"/>
+        </w:rPr>
+      </w:r>
+      <w:r>
+        <w:rPr>
+          <w:lang w:val="id_ID" w:bidi="id_ID"/>
+        </w:rPr>
+      </w:r>
+    </w:p>
+    <w:p>
+      <w:pPr/>
+      <w:r>
+        <w:rPr>
+          <w:lang w:val="id_ID" w:bidi="id_ID"/>
+        </w:rPr>
+      </w:r>
+    </w:p>
+    <w:p>
+      <w:pPr>
+        <w:pStyle w:val="Heading2"/>
+      </w:pPr>
+      <w:r>
+        <w:rPr>
+          <w:lang w:val="id_ID" w:bidi="id_ID"/>
+        </w:rPr>
+        <w:t>Habakuk 2:18–20</w:t>
+      </w:r>
+      <w:r>
+        <w:rPr>
+          <w:lang w:val="id_ID" w:bidi="id_ID"/>
+        </w:rPr>
+      </w:r>
+    </w:p>
+    <w:p>
+      <w:pPr/>
+      <w:r>
+        <w:rPr>
+          <w:lang w:val="id_ID" w:bidi="id_ID"/>
+        </w:rPr>
+      </w:r>
+      <w:r>
+        <w:rPr>
+          <w:lang w:val="id_ID" w:bidi="id_ID"/>
+        </w:rPr>
+        <w:t>Dalam nyanyian olok-olok yang kelima, orang-orang Babel dikutuk karena pengabdian mereka pada penyembahan berhala. Baik berhala yang diukir maupun yang dituang oleh tangan manusia</w:t>
+      </w:r>
+      <w:r>
+        <w:rPr>
+          <w:i/>
+          <w:lang w:val="id_ID" w:bidi="id_ID"/>
+        </w:rPr>
+        <w:t>,</w:t>
+      </w:r>
+      <w:r>
+        <w:rPr>
+          <w:lang w:val="id_ID" w:bidi="id_ID"/>
+        </w:rPr>
+        <w:t xml:space="preserve"> semuanya tidak dapat menyelamatkan atau mengajar penyembah-penyembah mereka (</w:t>
+      </w:r>
+      <w:hyperlink r:id="rId62">
+        <w:r>
+          <w:rPr>
+            <w:lang w:val="id_ID" w:bidi="id_ID"/>
+          </w:rPr>
+          <w:rPr>
+            <w:color w:val="0000EE"/>
+            <w:u w:val="single"/>
+          </w:rPr>
+          <w:t>Yes. 42:17</w:t>
+        </w:r>
+      </w:hyperlink>
+      <w:r>
+        <w:rPr>
+          <w:lang w:val="id_ID" w:bidi="id_ID"/>
+        </w:rPr>
+        <w:t>). Hanya Tuhan yang benar-benar layak menerima penyembahan kita (</w:t>
+      </w:r>
+      <w:hyperlink r:id="rId63">
+        <w:r>
+          <w:rPr>
+            <w:lang w:val="id_ID" w:bidi="id_ID"/>
+          </w:rPr>
+          <w:rPr>
+            <w:color w:val="0000EE"/>
+            <w:u w:val="single"/>
+          </w:rPr>
+          <w:t>Hab. 2:20</w:t>
+        </w:r>
+      </w:hyperlink>
+      <w:r>
+        <w:rPr>
+          <w:lang w:val="id_ID" w:bidi="id_ID"/>
+        </w:rPr>
+        <w:t xml:space="preserve">; </w:t>
+      </w:r>
+      <w:hyperlink r:id="rId64">
+        <w:r>
+          <w:rPr>
+            <w:lang w:val="id_ID" w:bidi="id_ID"/>
+          </w:rPr>
+          <w:rPr>
+            <w:color w:val="0000EE"/>
+            <w:u w:val="single"/>
+          </w:rPr>
+          <w:t>Kel. 20:2–6</w:t>
+        </w:r>
+      </w:hyperlink>
+      <w:r>
+        <w:rPr>
+          <w:lang w:val="id_ID" w:bidi="id_ID"/>
+        </w:rPr>
+        <w:t xml:space="preserve">; bdk. </w:t>
+      </w:r>
+      <w:hyperlink r:id="rId65">
+        <w:r>
+          <w:rPr>
+            <w:lang w:val="id_ID" w:bidi="id_ID"/>
+          </w:rPr>
+          <w:rPr>
+            <w:color w:val="0000EE"/>
+            <w:u w:val="single"/>
+          </w:rPr>
+          <w:t>Pkh. 5:1–2</w:t>
+        </w:r>
+      </w:hyperlink>
+      <w:r>
+        <w:rPr>
+          <w:lang w:val="id_ID" w:bidi="id_ID"/>
+        </w:rPr>
+        <w:t>).</w:t>
+      </w:r>
+      <w:r>
+        <w:rPr>
+          <w:lang w:val="id_ID" w:bidi="id_ID"/>
+        </w:rPr>
+      </w:r>
+      <w:r>
+        <w:rPr>
+          <w:lang w:val="id_ID" w:bidi="id_ID"/>
+        </w:rPr>
+      </w:r>
+    </w:p>
+    <w:p>
+      <w:pPr/>
+      <w:r>
+        <w:rPr>
+          <w:lang w:val="id_ID" w:bidi="id_ID"/>
+        </w:rPr>
+      </w:r>
+    </w:p>
+    <w:p>
+      <w:pPr>
+        <w:pStyle w:val="Heading2"/>
+      </w:pPr>
+      <w:r>
+        <w:rPr>
+          <w:lang w:val="id_ID" w:bidi="id_ID"/>
+        </w:rPr>
+        <w:t>Habakuk 2:20</w:t>
+      </w:r>
+      <w:r>
+        <w:rPr>
+          <w:lang w:val="id_ID" w:bidi="id_ID"/>
+        </w:rPr>
+      </w:r>
+    </w:p>
+    <w:p>
+      <w:pPr/>
+      <w:r>
+        <w:rPr>
+          <w:lang w:val="id_ID" w:bidi="id_ID"/>
+        </w:rPr>
+      </w:r>
+      <w:r>
+        <w:rPr>
+          <w:lang w:val="id_ID" w:bidi="id_ID"/>
+        </w:rPr>
+        <w:t>Nyanyian-nyanyian olok-olok diakhiri dengan pernyataan bahwa yang berdaulat atas semua bangsa bukanlah berhala Babel (</w:t>
+      </w:r>
+      <w:hyperlink r:id="rId53">
+        <w:r>
+          <w:rPr>
+            <w:lang w:val="id_ID" w:bidi="id_ID"/>
+          </w:rPr>
+          <w:rPr>
+            <w:color w:val="0000EE"/>
+            <w:u w:val="single"/>
+          </w:rPr>
+          <w:t>Hab. 2:18–20</w:t>
+        </w:r>
+      </w:hyperlink>
+      <w:r>
+        <w:rPr>
+          <w:lang w:val="id_ID" w:bidi="id_ID"/>
+        </w:rPr>
+        <w:t>), melainkan Allah Yang Maha Kudus. Tidak seperti berhala-berhala Babel yang tak bernyawa, Allah yang hidup berdiam di Bait Suci-Nya. Kehadiran Allah memenuhi tempat kudus surgawi-Nya (</w:t>
+      </w:r>
+      <w:hyperlink r:id="rId66">
+        <w:r>
+          <w:rPr>
+            <w:lang w:val="id_ID" w:bidi="id_ID"/>
+          </w:rPr>
+          <w:rPr>
+            <w:color w:val="0000EE"/>
+            <w:u w:val="single"/>
+          </w:rPr>
+          <w:t>Yes. 6:1–5</w:t>
+        </w:r>
+      </w:hyperlink>
+      <w:r>
+        <w:rPr>
+          <w:lang w:val="id_ID" w:bidi="id_ID"/>
+        </w:rPr>
+        <w:t>), dan pada zaman Habakuk, kehadiran Allah memenuhi Bait Suci di Yerusalem (</w:t>
+      </w:r>
+      <w:hyperlink r:id="rId67">
+        <w:r>
+          <w:rPr>
+            <w:lang w:val="id_ID" w:bidi="id_ID"/>
+          </w:rPr>
+          <w:rPr>
+            <w:color w:val="0000EE"/>
+            <w:u w:val="single"/>
+          </w:rPr>
+          <w:t>1Raj. 8:10–11</w:t>
+        </w:r>
+      </w:hyperlink>
+      <w:r>
+        <w:rPr>
+          <w:lang w:val="id_ID" w:bidi="id_ID"/>
+        </w:rPr>
+        <w:t>). Allah memegang kendali atas seluruh bumi dan mengharapkan umat untuk menyembah-Nya dengan penundukan dalam kerendahan hati (</w:t>
+      </w:r>
+      <w:hyperlink r:id="rId68">
+        <w:r>
+          <w:rPr>
+            <w:lang w:val="id_ID" w:bidi="id_ID"/>
+          </w:rPr>
+          <w:rPr>
+            <w:color w:val="0000EE"/>
+            <w:u w:val="single"/>
+          </w:rPr>
+          <w:t>Mzm. 63:1–4</w:t>
+        </w:r>
+      </w:hyperlink>
+      <w:r>
+        <w:rPr>
+          <w:lang w:val="id_ID" w:bidi="id_ID"/>
+        </w:rPr>
+        <w:t xml:space="preserve">; </w:t>
+      </w:r>
+      <w:hyperlink r:id="rId69">
+        <w:r>
+          <w:rPr>
+            <w:lang w:val="id_ID" w:bidi="id_ID"/>
+          </w:rPr>
+          <w:rPr>
+            <w:color w:val="0000EE"/>
+            <w:u w:val="single"/>
+          </w:rPr>
+          <w:t>Yer. 10:1–10</w:t>
+        </w:r>
+      </w:hyperlink>
+      <w:r>
+        <w:rPr>
+          <w:lang w:val="id_ID" w:bidi="id_ID"/>
+        </w:rPr>
+        <w:t xml:space="preserve">; </w:t>
+      </w:r>
+      <w:hyperlink r:id="rId70">
+        <w:r>
+          <w:rPr>
+            <w:lang w:val="id_ID" w:bidi="id_ID"/>
+          </w:rPr>
+          <w:rPr>
+            <w:color w:val="0000EE"/>
+            <w:u w:val="single"/>
+          </w:rPr>
+          <w:t>Mi. 7:16</w:t>
+        </w:r>
+      </w:hyperlink>
+      <w:r>
+        <w:rPr>
+          <w:lang w:val="id_ID" w:bidi="id_ID"/>
+        </w:rPr>
+        <w:t xml:space="preserve">; </w:t>
+      </w:r>
+      <w:hyperlink r:id="rId71">
+        <w:r>
+          <w:rPr>
+            <w:lang w:val="id_ID" w:bidi="id_ID"/>
+          </w:rPr>
+          <w:rPr>
+            <w:color w:val="0000EE"/>
+            <w:u w:val="single"/>
+          </w:rPr>
+          <w:t>Za. 2:13</w:t>
+        </w:r>
+      </w:hyperlink>
+      <w:r>
+        <w:rPr>
+          <w:lang w:val="id_ID" w:bidi="id_ID"/>
+        </w:rPr>
+        <w:t>).</w:t>
+      </w:r>
+      <w:r>
+        <w:rPr>
+          <w:lang w:val="id_ID" w:bidi="id_ID"/>
+        </w:rPr>
+      </w:r>
+      <w:r>
+        <w:rPr>
+          <w:lang w:val="id_ID" w:bidi="id_ID"/>
+        </w:rPr>
+      </w:r>
+    </w:p>
+    <w:p>
+      <w:pPr/>
+      <w:r>
+        <w:rPr>
+          <w:lang w:val="id_ID" w:bidi="id_ID"/>
+        </w:rPr>
+      </w:r>
+    </w:p>
+    <w:p>
+      <w:pPr>
+        <w:pStyle w:val="Heading2"/>
+      </w:pPr>
+      <w:r>
+        <w:rPr>
+          <w:lang w:val="id_ID" w:bidi="id_ID"/>
+        </w:rPr>
+        <w:t>Habakuk 3:1–19</w:t>
+      </w:r>
+      <w:r>
+        <w:rPr>
+          <w:lang w:val="id_ID" w:bidi="id_ID"/>
+        </w:rPr>
+      </w:r>
+    </w:p>
+    <w:p>
+      <w:pPr/>
+      <w:r>
+        <w:rPr>
+          <w:lang w:val="id_ID" w:bidi="id_ID"/>
+        </w:rPr>
+      </w:r>
+      <w:r>
+        <w:rPr>
+          <w:lang w:val="id_ID" w:bidi="id_ID"/>
+        </w:rPr>
+        <w:t>Nubuat Habakuk diakhiri dengan sebuah doa yang mirip dengan mazmur.</w:t>
+      </w:r>
+      <w:r>
+        <w:rPr>
+          <w:lang w:val="id_ID" w:bidi="id_ID"/>
+        </w:rPr>
+      </w:r>
+      <w:r>
+        <w:rPr>
+          <w:lang w:val="id_ID" w:bidi="id_ID"/>
+        </w:rPr>
+      </w:r>
+    </w:p>
+    <w:p>
+      <w:pPr/>
+      <w:r>
+        <w:rPr>
+          <w:lang w:val="id_ID" w:bidi="id_ID"/>
+        </w:rPr>
+      </w:r>
+    </w:p>
+    <w:p>
+      <w:pPr>
+        <w:pStyle w:val="Heading2"/>
+      </w:pPr>
+      <w:r>
+        <w:rPr>
+          <w:lang w:val="id_ID" w:bidi="id_ID"/>
+        </w:rPr>
+        <w:t>Habakuk 3:2</w:t>
+      </w:r>
+      <w:r>
+        <w:rPr>
+          <w:lang w:val="id_ID" w:bidi="id_ID"/>
+        </w:rPr>
+      </w:r>
+    </w:p>
+    <w:p>
+      <w:pPr/>
+      <w:r>
+        <w:rPr>
+          <w:lang w:val="id_ID" w:bidi="id_ID"/>
+        </w:rPr>
+      </w:r>
+      <w:r>
+        <w:rPr>
+          <w:lang w:val="id_ID" w:bidi="id_ID"/>
+        </w:rPr>
+        <w:t>Habakuk berdiri dengan kagum di hadapan Dia Yang Berdaulat yang duduk di takhta di Bait Suci-Nya (</w:t>
+      </w:r>
+      <w:hyperlink r:id="rId63">
+        <w:r>
+          <w:rPr>
+            <w:lang w:val="id_ID" w:bidi="id_ID"/>
+          </w:rPr>
+          <w:rPr>
+            <w:color w:val="0000EE"/>
+            <w:u w:val="single"/>
+          </w:rPr>
+          <w:t>Hab.</w:t>
+        </w:r>
+      </w:hyperlink>
+      <w:r>
+        <w:rPr>
+          <w:lang w:val="id_ID" w:bidi="id_ID"/>
+        </w:rPr>
+        <w:t xml:space="preserve"> </w:t>
+      </w:r>
+      <w:hyperlink r:id="rId63">
+        <w:r>
+          <w:rPr>
+            <w:lang w:val="id_ID" w:bidi="id_ID"/>
+          </w:rPr>
+          <w:rPr>
+            <w:color w:val="0000EE"/>
+            <w:u w:val="single"/>
+          </w:rPr>
+          <w:t>2:20</w:t>
+        </w:r>
+      </w:hyperlink>
+      <w:r>
+        <w:rPr>
+          <w:lang w:val="id_ID" w:bidi="id_ID"/>
+        </w:rPr>
+        <w:t xml:space="preserve">). • Mengingat pesan Allah tentang hukuman yang akan datang bagi Yehuda, Habakuk berdoa agar Allah, yang secara ajaib telah campur tangan bagi Israel di masa lalu, menyatakan karya penebusan-Nya sekali lagi (lihat juga </w:t>
+      </w:r>
+      <w:hyperlink r:id="rId72">
+        <w:r>
+          <w:rPr>
+            <w:lang w:val="id_ID" w:bidi="id_ID"/>
+          </w:rPr>
+          <w:rPr>
+            <w:color w:val="0000EE"/>
+            <w:u w:val="single"/>
+          </w:rPr>
+          <w:t>Mzm. 77</w:t>
+        </w:r>
+      </w:hyperlink>
+      <w:r>
+        <w:rPr>
+          <w:lang w:val="id_ID" w:bidi="id_ID"/>
+        </w:rPr>
+        <w:t>).</w:t>
+      </w:r>
+      <w:r>
+        <w:rPr>
+          <w:lang w:val="id_ID" w:bidi="id_ID"/>
+        </w:rPr>
+      </w:r>
+      <w:r>
+        <w:rPr>
+          <w:lang w:val="id_ID" w:bidi="id_ID"/>
+        </w:rPr>
+      </w:r>
+    </w:p>
+    <w:p>
+      <w:pPr/>
+      <w:r>
+        <w:rPr>
+          <w:lang w:val="id_ID" w:bidi="id_ID"/>
+        </w:rPr>
+      </w:r>
+    </w:p>
+    <w:p>
+      <w:pPr>
+        <w:pStyle w:val="Heading2"/>
+      </w:pPr>
+      <w:r>
+        <w:rPr>
+          <w:lang w:val="id_ID" w:bidi="id_ID"/>
+        </w:rPr>
+        <w:t>Habakuk 3:3</w:t>
+      </w:r>
+      <w:r>
+        <w:rPr>
+          <w:lang w:val="id_ID" w:bidi="id_ID"/>
+        </w:rPr>
+      </w:r>
+    </w:p>
+    <w:p>
+      <w:pPr/>
+      <w:r>
+        <w:rPr>
+          <w:lang w:val="id_ID" w:bidi="id_ID"/>
+        </w:rPr>
+      </w:r>
+      <w:r>
+        <w:rPr>
+          <w:lang w:val="id_ID" w:bidi="id_ID"/>
+        </w:rPr>
+        <w:t xml:space="preserve">Edom (Ibrani </w:t>
+      </w:r>
+      <w:r>
+        <w:rPr>
+          <w:i/>
+          <w:lang w:val="id_ID" w:bidi="id_ID"/>
+        </w:rPr>
+        <w:t>Téman</w:t>
+      </w:r>
+      <w:r>
+        <w:rPr>
+          <w:lang w:val="id_ID" w:bidi="id_ID"/>
+        </w:rPr>
+        <w:t xml:space="preserve">): Téman adalah salah satu kota utama di Edom (lihat juga </w:t>
+      </w:r>
+      <w:hyperlink r:id="rId73">
+        <w:r>
+          <w:rPr>
+            <w:lang w:val="id_ID" w:bidi="id_ID"/>
+          </w:rPr>
+          <w:rPr>
+            <w:color w:val="0000EE"/>
+            <w:u w:val="single"/>
+          </w:rPr>
+          <w:t>Ayub 2:11</w:t>
+        </w:r>
+      </w:hyperlink>
+      <w:r>
+        <w:rPr>
+          <w:lang w:val="id_ID" w:bidi="id_ID"/>
+        </w:rPr>
+        <w:t xml:space="preserve">; </w:t>
+      </w:r>
+      <w:hyperlink r:id="rId74">
+        <w:r>
+          <w:rPr>
+            <w:lang w:val="id_ID" w:bidi="id_ID"/>
+          </w:rPr>
+          <w:rPr>
+            <w:color w:val="0000EE"/>
+            <w:u w:val="single"/>
+          </w:rPr>
+          <w:t>Yer. 49:7</w:t>
+        </w:r>
+      </w:hyperlink>
+      <w:r>
+        <w:rPr>
+          <w:lang w:val="id_ID" w:bidi="id_ID"/>
+        </w:rPr>
+        <w:t xml:space="preserve">); istilah ini dapat merujuk pada seluruh wilayah Edom di mana kota tersebut berada (bdk. </w:t>
+      </w:r>
+      <w:hyperlink r:id="rId75">
+        <w:r>
+          <w:rPr>
+            <w:lang w:val="id_ID" w:bidi="id_ID"/>
+          </w:rPr>
+          <w:rPr>
+            <w:color w:val="0000EE"/>
+            <w:u w:val="single"/>
+          </w:rPr>
+          <w:t>Ob. 1:9</w:t>
+        </w:r>
+      </w:hyperlink>
+      <w:r>
+        <w:rPr>
+          <w:lang w:val="id_ID" w:bidi="id_ID"/>
+        </w:rPr>
+        <w:t>). Penggunaan istilah ini oleh Habakuk bersama dengan pegunungan Paran menunjukkan bahwa yang dia maksudkan adalah wilayah yang lebih luas. • Yang Mahakudus adalah salah satu gelar yang utama untuk Allah, karena kekudusan adalah karakteristik utama-Nya (</w:t>
+      </w:r>
+      <w:hyperlink r:id="rId76">
+        <w:r>
+          <w:rPr>
+            <w:lang w:val="id_ID" w:bidi="id_ID"/>
+          </w:rPr>
+          <w:rPr>
+            <w:color w:val="0000EE"/>
+            <w:u w:val="single"/>
+          </w:rPr>
+          <w:t>Hab. 1:12</w:t>
+        </w:r>
+      </w:hyperlink>
+      <w:r>
+        <w:rPr>
+          <w:lang w:val="id_ID" w:bidi="id_ID"/>
+        </w:rPr>
+        <w:t xml:space="preserve">; lihat juga </w:t>
+      </w:r>
+      <w:hyperlink r:id="rId77">
+        <w:r>
+          <w:rPr>
+            <w:lang w:val="id_ID" w:bidi="id_ID"/>
+          </w:rPr>
+          <w:rPr>
+            <w:color w:val="0000EE"/>
+            <w:u w:val="single"/>
+          </w:rPr>
+          <w:t>Kel. 15:11</w:t>
+        </w:r>
+      </w:hyperlink>
+      <w:r>
+        <w:rPr>
+          <w:lang w:val="id_ID" w:bidi="id_ID"/>
+        </w:rPr>
+        <w:t xml:space="preserve">; </w:t>
+      </w:r>
+      <w:hyperlink r:id="rId78">
+        <w:r>
+          <w:rPr>
+            <w:lang w:val="id_ID" w:bidi="id_ID"/>
+          </w:rPr>
+          <w:rPr>
+            <w:color w:val="0000EE"/>
+            <w:u w:val="single"/>
+          </w:rPr>
+          <w:t>2Raj. 19:22</w:t>
+        </w:r>
+      </w:hyperlink>
+      <w:r>
+        <w:rPr>
+          <w:lang w:val="id_ID" w:bidi="id_ID"/>
+        </w:rPr>
+        <w:t xml:space="preserve">; </w:t>
+      </w:r>
+      <w:hyperlink r:id="rId79">
+        <w:r>
+          <w:rPr>
+            <w:lang w:val="id_ID" w:bidi="id_ID"/>
+          </w:rPr>
+          <w:rPr>
+            <w:color w:val="0000EE"/>
+            <w:u w:val="single"/>
+          </w:rPr>
+          <w:t>Mzm. 77:13</w:t>
+        </w:r>
+      </w:hyperlink>
+      <w:r>
+        <w:rPr>
+          <w:lang w:val="id_ID" w:bidi="id_ID"/>
+        </w:rPr>
+        <w:t xml:space="preserve">; </w:t>
+      </w:r>
+      <w:hyperlink r:id="rId80">
+        <w:r>
+          <w:rPr>
+            <w:lang w:val="id_ID" w:bidi="id_ID"/>
+          </w:rPr>
+          <w:rPr>
+            <w:color w:val="0000EE"/>
+            <w:u w:val="single"/>
+          </w:rPr>
+          <w:t>Yes. 6:3</w:t>
+        </w:r>
+      </w:hyperlink>
+      <w:r>
+        <w:rPr>
+          <w:lang w:val="id_ID" w:bidi="id_ID"/>
+        </w:rPr>
+        <w:t>). • Pegunungan Paran: Wilayah Paran mencakup pegunungan di barat dan selatan Edom serta timur laut Gunung Sinai, dan juga area gurun yang luas di Semenanjung Sinai.</w:t>
+      </w:r>
+      <w:r>
+        <w:rPr>
+          <w:lang w:val="id_ID" w:bidi="id_ID"/>
+        </w:rPr>
+      </w:r>
+      <w:r>
+        <w:rPr>
+          <w:lang w:val="id_ID" w:bidi="id_ID"/>
+        </w:rPr>
+      </w:r>
+    </w:p>
+    <w:p>
+      <w:pPr/>
+      <w:r>
+        <w:rPr>
+          <w:lang w:val="id_ID" w:bidi="id_ID"/>
+        </w:rPr>
+      </w:r>
+    </w:p>
+    <w:p>
+      <w:pPr>
+        <w:pStyle w:val="Heading2"/>
+      </w:pPr>
+      <w:r>
+        <w:rPr>
+          <w:lang w:val="id_ID" w:bidi="id_ID"/>
+        </w:rPr>
+        <w:t>Habakuk 3:3–15</w:t>
+      </w:r>
+      <w:r>
+        <w:rPr>
+          <w:lang w:val="id_ID" w:bidi="id_ID"/>
+        </w:rPr>
+      </w:r>
+    </w:p>
+    <w:p>
+      <w:pPr/>
+      <w:r>
+        <w:rPr>
+          <w:lang w:val="id_ID" w:bidi="id_ID"/>
+        </w:rPr>
+      </w:r>
+      <w:r>
+        <w:rPr>
+          <w:lang w:val="id_ID" w:bidi="id_ID"/>
+        </w:rPr>
+        <w:t>Nabi memuji kekuasaan Allah yang sanggup menyelamatkan. Dua bait pujian ini (</w:t>
+      </w:r>
+      <w:hyperlink r:id="rId81">
+        <w:r>
+          <w:rPr>
+            <w:lang w:val="id_ID" w:bidi="id_ID"/>
+          </w:rPr>
+          <w:rPr>
+            <w:color w:val="0000EE"/>
+            <w:u w:val="single"/>
+          </w:rPr>
+          <w:t>Hab.</w:t>
+        </w:r>
+      </w:hyperlink>
+      <w:r>
+        <w:rPr>
+          <w:lang w:val="id_ID" w:bidi="id_ID"/>
+        </w:rPr>
+        <w:t xml:space="preserve"> </w:t>
+      </w:r>
+      <w:hyperlink r:id="rId81">
+        <w:r>
+          <w:rPr>
+            <w:lang w:val="id_ID" w:bidi="id_ID"/>
+          </w:rPr>
+          <w:rPr>
+            <w:color w:val="0000EE"/>
+            <w:u w:val="single"/>
+          </w:rPr>
+          <w:t>3:3–7</w:t>
+        </w:r>
+      </w:hyperlink>
+      <w:r>
+        <w:rPr>
+          <w:lang w:val="id_ID" w:bidi="id_ID"/>
+        </w:rPr>
+        <w:t xml:space="preserve"> dan </w:t>
+      </w:r>
+      <w:hyperlink r:id="rId82">
+        <w:r>
+          <w:rPr>
+            <w:lang w:val="id_ID" w:bidi="id_ID"/>
+          </w:rPr>
+          <w:rPr>
+            <w:color w:val="0000EE"/>
+            <w:u w:val="single"/>
+          </w:rPr>
+          <w:t>Hab. 3:8–15</w:t>
+        </w:r>
+      </w:hyperlink>
+      <w:r>
+        <w:rPr>
+          <w:lang w:val="id_ID" w:bidi="id_ID"/>
+        </w:rPr>
+        <w:t xml:space="preserve">) merupakan refleksi puitis atas pengalaman Israel keluar dari Mesir. Meskipun fokus Habakuk adalah pada penebusan Allah terhadap umat-Nya, gambaran yang dipakainya kadang-kadang mencerminkan gagasan yang didapati dalam kisah-kisah Timur Dekat kuno tentang dewa-dewa (misalnya, penyakit dan wabah, </w:t>
+      </w:r>
+      <w:hyperlink r:id="rId83">
+        <w:r>
+          <w:rPr>
+            <w:lang w:val="id_ID" w:bidi="id_ID"/>
+          </w:rPr>
+          <w:rPr>
+            <w:color w:val="0000EE"/>
+            <w:u w:val="single"/>
+          </w:rPr>
+          <w:t>Hab. 3:5</w:t>
+        </w:r>
+      </w:hyperlink>
+      <w:r>
+        <w:rPr>
+          <w:lang w:val="id_ID" w:bidi="id_ID"/>
+        </w:rPr>
+        <w:t xml:space="preserve">; sungai dan laut, </w:t>
+      </w:r>
+      <w:hyperlink r:id="rId84">
+        <w:r>
+          <w:rPr>
+            <w:lang w:val="id_ID" w:bidi="id_ID"/>
+          </w:rPr>
+          <w:rPr>
+            <w:color w:val="0000EE"/>
+            <w:u w:val="single"/>
+          </w:rPr>
+          <w:t>Hab. 3:8</w:t>
+        </w:r>
+      </w:hyperlink>
+      <w:r>
+        <w:rPr>
+          <w:lang w:val="id_ID" w:bidi="id_ID"/>
+        </w:rPr>
+        <w:t xml:space="preserve">; matahari dan bulan, </w:t>
+      </w:r>
+      <w:hyperlink r:id="rId85">
+        <w:r>
+          <w:rPr>
+            <w:lang w:val="id_ID" w:bidi="id_ID"/>
+          </w:rPr>
+          <w:rPr>
+            <w:color w:val="0000EE"/>
+            <w:u w:val="single"/>
+          </w:rPr>
+          <w:t>Hab. 3:11</w:t>
+        </w:r>
+      </w:hyperlink>
+      <w:r>
+        <w:rPr>
+          <w:lang w:val="id_ID" w:bidi="id_ID"/>
+        </w:rPr>
+        <w:t>). Penggambaran ini mengingatkan pembaca pertama Habakuk bahwa hanya Tuhanlah satu-satunya Allah sejati yang berdaulat atas semua hal ini.</w:t>
+      </w:r>
+      <w:r>
+        <w:rPr>
+          <w:lang w:val="id_ID" w:bidi="id_ID"/>
+        </w:rPr>
+      </w:r>
+      <w:r>
+        <w:rPr>
+          <w:lang w:val="id_ID" w:bidi="id_ID"/>
+        </w:rPr>
+      </w:r>
+    </w:p>
+    <w:p>
+      <w:pPr/>
+      <w:r>
+        <w:rPr>
+          <w:lang w:val="id_ID" w:bidi="id_ID"/>
+        </w:rPr>
+      </w:r>
+    </w:p>
+    <w:p>
+      <w:pPr>
+        <w:pStyle w:val="Heading2"/>
+      </w:pPr>
+      <w:r>
+        <w:rPr>
+          <w:lang w:val="id_ID" w:bidi="id_ID"/>
+        </w:rPr>
+        <w:t>Habakuk 3:4</w:t>
+      </w:r>
+      <w:r>
+        <w:rPr>
+          <w:lang w:val="id_ID" w:bidi="id_ID"/>
+        </w:rPr>
+      </w:r>
+    </w:p>
+    <w:p>
+      <w:pPr/>
+      <w:r>
+        <w:rPr>
+          <w:lang w:val="id_ID" w:bidi="id_ID"/>
+        </w:rPr>
+      </w:r>
+      <w:r>
+        <w:rPr>
+          <w:lang w:val="id_ID" w:bidi="id_ID"/>
+        </w:rPr>
+        <w:t>kilauan seperti cahaya: Tuhan, yang pernah menampakkan diri di Gunung Sinai dan memenuhi tanah selatan dengan kemuliaan-Nya, kini memenuhi langit dengan keagungan-Nya.</w:t>
+      </w:r>
+      <w:r>
+        <w:rPr>
+          <w:lang w:val="id_ID" w:bidi="id_ID"/>
+        </w:rPr>
+      </w:r>
+      <w:r>
+        <w:rPr>
+          <w:lang w:val="id_ID" w:bidi="id_ID"/>
+        </w:rPr>
+      </w:r>
+    </w:p>
+    <w:p>
+      <w:pPr/>
+      <w:r>
+        <w:rPr>
+          <w:lang w:val="id_ID" w:bidi="id_ID"/>
+        </w:rPr>
+      </w:r>
+    </w:p>
+    <w:p>
+      <w:pPr>
+        <w:pStyle w:val="Heading2"/>
+      </w:pPr>
+      <w:r>
+        <w:rPr>
+          <w:lang w:val="id_ID" w:bidi="id_ID"/>
+        </w:rPr>
+        <w:t>Habakuk 3:5</w:t>
+      </w:r>
+      <w:r>
+        <w:rPr>
+          <w:lang w:val="id_ID" w:bidi="id_ID"/>
+        </w:rPr>
+      </w:r>
+    </w:p>
+    <w:p>
+      <w:pPr/>
+      <w:r>
+        <w:rPr>
+          <w:lang w:val="id_ID" w:bidi="id_ID"/>
+        </w:rPr>
+      </w:r>
+      <w:r>
+        <w:rPr>
+          <w:lang w:val="id_ID" w:bidi="id_ID"/>
+        </w:rPr>
+        <w:t xml:space="preserve">Habakuk mempersonifikasikan penyakit sampar (lihat </w:t>
+      </w:r>
+      <w:hyperlink r:id="rId86">
+        <w:r>
+          <w:rPr>
+            <w:lang w:val="id_ID" w:bidi="id_ID"/>
+          </w:rPr>
+          <w:rPr>
+            <w:color w:val="0000EE"/>
+            <w:u w:val="single"/>
+          </w:rPr>
+          <w:t>Ul. 32:24</w:t>
+        </w:r>
+      </w:hyperlink>
+      <w:r>
+        <w:rPr>
+          <w:lang w:val="id_ID" w:bidi="id_ID"/>
+        </w:rPr>
+        <w:t xml:space="preserve">) dan wabah (lihat </w:t>
+      </w:r>
+      <w:hyperlink r:id="rId87">
+        <w:r>
+          <w:rPr>
+            <w:lang w:val="id_ID" w:bidi="id_ID"/>
+          </w:rPr>
+          <w:rPr>
+            <w:color w:val="0000EE"/>
+            <w:u w:val="single"/>
+          </w:rPr>
+          <w:t>Kel. 7–12</w:t>
+        </w:r>
+      </w:hyperlink>
+      <w:r>
+        <w:rPr>
+          <w:lang w:val="id_ID" w:bidi="id_ID"/>
+        </w:rPr>
+        <w:t xml:space="preserve">; </w:t>
+      </w:r>
+      <w:hyperlink r:id="rId88">
+        <w:r>
+          <w:rPr>
+            <w:lang w:val="id_ID" w:bidi="id_ID"/>
+          </w:rPr>
+          <w:rPr>
+            <w:color w:val="0000EE"/>
+            <w:u w:val="single"/>
+          </w:rPr>
+          <w:t>Amos 4:10</w:t>
+        </w:r>
+      </w:hyperlink>
+      <w:r>
+        <w:rPr>
+          <w:lang w:val="id_ID" w:bidi="id_ID"/>
+        </w:rPr>
+        <w:t>) sebagai prajurit-prajurit dalam pasukan Allah, yang menjalankan tujuan-Nya.</w:t>
+      </w:r>
+      <w:r>
+        <w:rPr>
+          <w:lang w:val="id_ID" w:bidi="id_ID"/>
+        </w:rPr>
+      </w:r>
+      <w:r>
+        <w:rPr>
+          <w:lang w:val="id_ID" w:bidi="id_ID"/>
+        </w:rPr>
+      </w:r>
+    </w:p>
+    <w:p>
+      <w:pPr/>
+      <w:r>
+        <w:rPr>
+          <w:lang w:val="id_ID" w:bidi="id_ID"/>
+        </w:rPr>
+      </w:r>
+    </w:p>
+    <w:p>
+      <w:pPr>
+        <w:pStyle w:val="Heading2"/>
+      </w:pPr>
+      <w:r>
+        <w:rPr>
+          <w:lang w:val="id_ID" w:bidi="id_ID"/>
+        </w:rPr>
+        <w:t>Habakuk 3:5–6</w:t>
+      </w:r>
+      <w:r>
+        <w:rPr>
+          <w:lang w:val="id_ID" w:bidi="id_ID"/>
+        </w:rPr>
+      </w:r>
+    </w:p>
+    <w:p>
+      <w:pPr/>
+      <w:r>
+        <w:rPr>
+          <w:lang w:val="id_ID" w:bidi="id_ID"/>
+        </w:rPr>
+      </w:r>
+      <w:r>
+        <w:rPr>
+          <w:lang w:val="id_ID" w:bidi="id_ID"/>
+        </w:rPr>
+        <w:t xml:space="preserve">Allah adalah pahlawan ilahi yang turun tangan demi kepentingan umat-Nya (lihat </w:t>
+      </w:r>
+      <w:hyperlink r:id="rId82">
+        <w:r>
+          <w:rPr>
+            <w:lang w:val="id_ID" w:bidi="id_ID"/>
+          </w:rPr>
+          <w:rPr>
+            <w:color w:val="0000EE"/>
+            <w:u w:val="single"/>
+          </w:rPr>
+          <w:t>Hab.</w:t>
+        </w:r>
+      </w:hyperlink>
+      <w:r>
+        <w:rPr>
+          <w:lang w:val="id_ID" w:bidi="id_ID"/>
+        </w:rPr>
+        <w:t xml:space="preserve"> </w:t>
+      </w:r>
+      <w:hyperlink r:id="rId82">
+        <w:r>
+          <w:rPr>
+            <w:lang w:val="id_ID" w:bidi="id_ID"/>
+          </w:rPr>
+          <w:rPr>
+            <w:color w:val="0000EE"/>
+            <w:u w:val="single"/>
+          </w:rPr>
+          <w:t>3:8–15</w:t>
+        </w:r>
+      </w:hyperlink>
+      <w:r>
+        <w:rPr>
+          <w:lang w:val="id_ID" w:bidi="id_ID"/>
+        </w:rPr>
+        <w:t xml:space="preserve">; lihat juga </w:t>
+      </w:r>
+      <w:hyperlink r:id="rId89">
+        <w:r>
+          <w:rPr>
+            <w:lang w:val="id_ID" w:bidi="id_ID"/>
+          </w:rPr>
+          <w:rPr>
+            <w:color w:val="0000EE"/>
+            <w:u w:val="single"/>
+          </w:rPr>
+          <w:t>Yes. 63:1–6</w:t>
+        </w:r>
+      </w:hyperlink>
+      <w:r>
+        <w:rPr>
+          <w:lang w:val="id_ID" w:bidi="id_ID"/>
+        </w:rPr>
+        <w:t>).</w:t>
+      </w:r>
+      <w:r>
+        <w:rPr>
+          <w:lang w:val="id_ID" w:bidi="id_ID"/>
+        </w:rPr>
+      </w:r>
+      <w:r>
+        <w:rPr>
+          <w:lang w:val="id_ID" w:bidi="id_ID"/>
+        </w:rPr>
+      </w:r>
+    </w:p>
+    <w:p>
+      <w:pPr/>
+      <w:r>
+        <w:rPr>
+          <w:lang w:val="id_ID" w:bidi="id_ID"/>
+        </w:rPr>
+      </w:r>
+    </w:p>
+    <w:p>
+      <w:pPr>
+        <w:pStyle w:val="Heading2"/>
+      </w:pPr>
+      <w:r>
+        <w:rPr>
+          <w:lang w:val="id_ID" w:bidi="id_ID"/>
+        </w:rPr>
+        <w:t>Habakuk 3:7</w:t>
+      </w:r>
+      <w:r>
+        <w:rPr>
+          <w:lang w:val="id_ID" w:bidi="id_ID"/>
+        </w:rPr>
+      </w:r>
+    </w:p>
+    <w:p>
+      <w:pPr/>
+      <w:r>
+        <w:rPr>
+          <w:lang w:val="id_ID" w:bidi="id_ID"/>
+        </w:rPr>
+      </w:r>
+      <w:r>
+        <w:rPr>
+          <w:lang w:val="id_ID" w:bidi="id_ID"/>
+        </w:rPr>
+        <w:t xml:space="preserve">Midian menempati bagian selatan wilayah yang terletak tepat di timur Yordan (lihat </w:t>
+      </w:r>
+      <w:hyperlink r:id="rId90">
+        <w:r>
+          <w:rPr>
+            <w:lang w:val="id_ID" w:bidi="id_ID"/>
+          </w:rPr>
+          <w:rPr>
+            <w:color w:val="0000EE"/>
+            <w:u w:val="single"/>
+          </w:rPr>
+          <w:t>Kej. 36:35</w:t>
+        </w:r>
+      </w:hyperlink>
+      <w:r>
+        <w:rPr>
+          <w:lang w:val="id_ID" w:bidi="id_ID"/>
+        </w:rPr>
+        <w:t>); bangsa itu gemetar ketakutan akan kekuatan yang mengguncang bumi dari kehadiran Allah (</w:t>
+      </w:r>
+      <w:hyperlink r:id="rId91">
+        <w:r>
+          <w:rPr>
+            <w:lang w:val="id_ID" w:bidi="id_ID"/>
+          </w:rPr>
+          <w:rPr>
+            <w:color w:val="0000EE"/>
+            <w:u w:val="single"/>
+          </w:rPr>
+          <w:t>Hab. 3:6</w:t>
+        </w:r>
+      </w:hyperlink>
+      <w:r>
+        <w:rPr>
+          <w:lang w:val="id_ID" w:bidi="id_ID"/>
+        </w:rPr>
+        <w:t>).</w:t>
+      </w:r>
+      <w:r>
+        <w:rPr>
+          <w:lang w:val="id_ID" w:bidi="id_ID"/>
+        </w:rPr>
+      </w:r>
+      <w:r>
+        <w:rPr>
+          <w:lang w:val="id_ID" w:bidi="id_ID"/>
+        </w:rPr>
+      </w:r>
+    </w:p>
+    <w:p>
+      <w:pPr/>
+      <w:r>
+        <w:rPr>
+          <w:lang w:val="id_ID" w:bidi="id_ID"/>
+        </w:rPr>
+      </w:r>
+    </w:p>
+    <w:p>
+      <w:pPr>
+        <w:pStyle w:val="Heading2"/>
+      </w:pPr>
+      <w:r>
+        <w:rPr>
+          <w:lang w:val="id_ID" w:bidi="id_ID"/>
+        </w:rPr>
+        <w:t>Habakuk 3:8</w:t>
+      </w:r>
+      <w:r>
+        <w:rPr>
+          <w:lang w:val="id_ID" w:bidi="id_ID"/>
+        </w:rPr>
+      </w:r>
+    </w:p>
+    <w:p>
+      <w:pPr/>
+      <w:r>
+        <w:rPr>
+          <w:lang w:val="id_ID" w:bidi="id_ID"/>
+        </w:rPr>
+      </w:r>
+      <w:r>
+        <w:rPr>
+          <w:lang w:val="id_ID" w:bidi="id_ID"/>
+        </w:rPr>
+        <w:t xml:space="preserve">terhadap sungai-sungaikah … terhadap lautkah: Lihat </w:t>
+      </w:r>
+      <w:hyperlink r:id="rId92">
+        <w:r>
+          <w:rPr>
+            <w:lang w:val="id_ID" w:bidi="id_ID"/>
+          </w:rPr>
+          <w:rPr>
+            <w:color w:val="0000EE"/>
+            <w:u w:val="single"/>
+          </w:rPr>
+          <w:t>Kel. 7:19–20</w:t>
+        </w:r>
+      </w:hyperlink>
+      <w:r>
+        <w:rPr>
+          <w:lang w:val="id_ID" w:bidi="id_ID"/>
+        </w:rPr>
+        <w:t xml:space="preserve">; </w:t>
+      </w:r>
+      <w:hyperlink r:id="rId93">
+        <w:r>
+          <w:rPr>
+            <w:lang w:val="id_ID" w:bidi="id_ID"/>
+          </w:rPr>
+          <w:rPr>
+            <w:color w:val="0000EE"/>
+            <w:u w:val="single"/>
+          </w:rPr>
+          <w:t>14:15–31</w:t>
+        </w:r>
+      </w:hyperlink>
+      <w:r>
+        <w:rPr>
+          <w:lang w:val="id_ID" w:bidi="id_ID"/>
+        </w:rPr>
+        <w:t>. • kereta kemenangan: Sebuah ironi atau sindiran yang merujuk kembali pada peristiwa kereta-kereta Mesir yang mengejar orang-orang Israel ketika Allah memimpin mereka untuk meluputkan diri melalui Laut Merah (</w:t>
+      </w:r>
+      <w:hyperlink r:id="rId94">
+        <w:r>
+          <w:rPr>
+            <w:lang w:val="id_ID" w:bidi="id_ID"/>
+          </w:rPr>
+          <w:rPr>
+            <w:color w:val="0000EE"/>
+            <w:u w:val="single"/>
+          </w:rPr>
+          <w:t>Kel. 14:9</w:t>
+        </w:r>
+      </w:hyperlink>
+      <w:r>
+        <w:rPr>
+          <w:lang w:val="id_ID" w:bidi="id_ID"/>
+        </w:rPr>
+        <w:t>).</w:t>
+      </w:r>
+      <w:r>
+        <w:rPr>
+          <w:lang w:val="id_ID" w:bidi="id_ID"/>
+        </w:rPr>
+      </w:r>
+      <w:r>
+        <w:rPr>
+          <w:lang w:val="id_ID" w:bidi="id_ID"/>
+        </w:rPr>
+      </w:r>
+    </w:p>
+    <w:p>
+      <w:pPr/>
+      <w:r>
+        <w:rPr>
+          <w:lang w:val="id_ID" w:bidi="id_ID"/>
+        </w:rPr>
+      </w:r>
+    </w:p>
+    <w:p>
+      <w:pPr>
+        <w:pStyle w:val="Heading2"/>
+      </w:pPr>
+      <w:r>
+        <w:rPr>
+          <w:lang w:val="id_ID" w:bidi="id_ID"/>
+        </w:rPr>
+        <w:t>Habakuk 3:8–15</w:t>
+      </w:r>
+      <w:r>
+        <w:rPr>
+          <w:lang w:val="id_ID" w:bidi="id_ID"/>
+        </w:rPr>
+      </w:r>
+    </w:p>
+    <w:p>
+      <w:pPr/>
+      <w:r>
+        <w:rPr>
+          <w:lang w:val="id_ID" w:bidi="id_ID"/>
+        </w:rPr>
+      </w:r>
+      <w:r>
+        <w:rPr>
+          <w:lang w:val="id_ID" w:bidi="id_ID"/>
+        </w:rPr>
+        <w:t>Tuhan adalah pejuang ilahi bagi umat-Nya, yang bergerak dengan kuasa penebusan demi mereka. Motif Allah sebagai pejuang ilahi mencakup baik Perjanjian Lama maupun Perjanjian Baru: Hal ini terlihat dalam keluarnya Israel dari Mesir, perjalanan mereka ke Gunung Sinai (</w:t>
+      </w:r>
+      <w:hyperlink r:id="rId95">
+        <w:r>
+          <w:rPr>
+            <w:lang w:val="id_ID" w:bidi="id_ID"/>
+          </w:rPr>
+          <w:rPr>
+            <w:color w:val="0000EE"/>
+            <w:u w:val="single"/>
+          </w:rPr>
+          <w:t>Kel. 15:1–18</w:t>
+        </w:r>
+      </w:hyperlink>
+      <w:r>
+        <w:rPr>
+          <w:lang w:val="id_ID" w:bidi="id_ID"/>
+        </w:rPr>
+        <w:t xml:space="preserve">), mencapai Tanah Perjanjian dari sebelah selatan, dan kemenangan mereka dalam periode penaklukkan awal (misalnya, </w:t>
+      </w:r>
+      <w:hyperlink r:id="rId96">
+        <w:r>
+          <w:rPr>
+            <w:lang w:val="id_ID" w:bidi="id_ID"/>
+          </w:rPr>
+          <w:rPr>
+            <w:color w:val="0000EE"/>
+            <w:u w:val="single"/>
+          </w:rPr>
+          <w:t>Hak. 5:4–5</w:t>
+        </w:r>
+      </w:hyperlink>
+      <w:r>
+        <w:rPr>
+          <w:lang w:val="id_ID" w:bidi="id_ID"/>
+        </w:rPr>
+        <w:t xml:space="preserve">; </w:t>
+      </w:r>
+      <w:hyperlink r:id="rId97">
+        <w:r>
+          <w:rPr>
+            <w:lang w:val="id_ID" w:bidi="id_ID"/>
+          </w:rPr>
+          <w:rPr>
+            <w:color w:val="0000EE"/>
+            <w:u w:val="single"/>
+          </w:rPr>
+          <w:t>Mzm. 18:8–16</w:t>
+        </w:r>
+      </w:hyperlink>
+      <w:r>
+        <w:rPr>
+          <w:lang w:val="id_ID" w:bidi="id_ID"/>
+        </w:rPr>
+        <w:t xml:space="preserve">; </w:t>
+      </w:r>
+      <w:hyperlink r:id="rId98">
+        <w:r>
+          <w:rPr>
+            <w:lang w:val="id_ID" w:bidi="id_ID"/>
+          </w:rPr>
+          <w:rPr>
+            <w:color w:val="0000EE"/>
+            <w:u w:val="single"/>
+          </w:rPr>
+          <w:t>77:16–20</w:t>
+        </w:r>
+      </w:hyperlink>
+      <w:r>
+        <w:rPr>
+          <w:lang w:val="id_ID" w:bidi="id_ID"/>
+        </w:rPr>
+        <w:t xml:space="preserve">; contoh penting dari Perjanjian Baru adalah </w:t>
+      </w:r>
+      <w:hyperlink r:id="rId99">
+        <w:r>
+          <w:rPr>
+            <w:lang w:val="id_ID" w:bidi="id_ID"/>
+          </w:rPr>
+          <w:rPr>
+            <w:color w:val="0000EE"/>
+            <w:u w:val="single"/>
+          </w:rPr>
+          <w:t>Why. 19:11–21</w:t>
+        </w:r>
+      </w:hyperlink>
+      <w:r>
+        <w:rPr>
+          <w:lang w:val="id_ID" w:bidi="id_ID"/>
+        </w:rPr>
+        <w:t>).</w:t>
+      </w:r>
+      <w:r>
+        <w:rPr>
+          <w:lang w:val="id_ID" w:bidi="id_ID"/>
+        </w:rPr>
+      </w:r>
+      <w:r>
+        <w:rPr>
+          <w:lang w:val="id_ID" w:bidi="id_ID"/>
+        </w:rPr>
+      </w:r>
+    </w:p>
+    <w:p>
+      <w:pPr/>
+      <w:r>
+        <w:rPr>
+          <w:lang w:val="id_ID" w:bidi="id_ID"/>
+        </w:rPr>
+      </w:r>
+    </w:p>
+    <w:p>
+      <w:pPr>
+        <w:pStyle w:val="Heading2"/>
+      </w:pPr>
+      <w:r>
+        <w:rPr>
+          <w:lang w:val="id_ID" w:bidi="id_ID"/>
+        </w:rPr>
+        <w:t>Habakuk 3:9–11</w:t>
+      </w:r>
+      <w:r>
+        <w:rPr>
+          <w:lang w:val="id_ID" w:bidi="id_ID"/>
+        </w:rPr>
+      </w:r>
+    </w:p>
+    <w:p>
+      <w:pPr/>
+      <w:r>
+        <w:rPr>
+          <w:lang w:val="id_ID" w:bidi="id_ID"/>
+        </w:rPr>
+      </w:r>
+      <w:r>
+        <w:rPr>
+          <w:lang w:val="id_ID" w:bidi="id_ID"/>
+        </w:rPr>
+        <w:t>Hanya Allah yang memegang kendali atas segala kuasa di alam semesta.</w:t>
+      </w:r>
+      <w:r>
+        <w:rPr>
+          <w:lang w:val="id_ID" w:bidi="id_ID"/>
+        </w:rPr>
+      </w:r>
+      <w:r>
+        <w:rPr>
+          <w:lang w:val="id_ID" w:bidi="id_ID"/>
+        </w:rPr>
+      </w:r>
+    </w:p>
+    <w:p>
+      <w:pPr/>
+      <w:r>
+        <w:rPr>
+          <w:lang w:val="id_ID" w:bidi="id_ID"/>
+        </w:rPr>
+      </w:r>
+    </w:p>
+    <w:p>
+      <w:pPr>
+        <w:pStyle w:val="Heading2"/>
+      </w:pPr>
+      <w:r>
+        <w:rPr>
+          <w:lang w:val="id_ID" w:bidi="id_ID"/>
+        </w:rPr>
+        <w:t>Habakuk 3:10</w:t>
+      </w:r>
+      <w:r>
+        <w:rPr>
+          <w:lang w:val="id_ID" w:bidi="id_ID"/>
+        </w:rPr>
+      </w:r>
+    </w:p>
+    <w:p>
+      <w:pPr/>
+      <w:r>
+        <w:rPr>
+          <w:lang w:val="id_ID" w:bidi="id_ID"/>
+        </w:rPr>
+      </w:r>
+      <w:r>
+        <w:rPr>
+          <w:lang w:val="id_ID" w:bidi="id_ID"/>
+        </w:rPr>
+        <w:t xml:space="preserve">air bah: Lihat </w:t>
+      </w:r>
+      <w:r>
+        <w:rPr>
+          <w:lang w:val="id_ID" w:bidi="id_ID"/>
+        </w:rPr>
+        <w:t>catatan studi Habakuk 3:8</w:t>
+      </w:r>
+      <w:r>
+        <w:rPr>
+          <w:lang w:val="id_ID" w:bidi="id_ID"/>
+        </w:rPr>
+        <w:t xml:space="preserve">; lihat juga </w:t>
+      </w:r>
+      <w:hyperlink r:id="rId95">
+        <w:r>
+          <w:rPr>
+            <w:lang w:val="id_ID" w:bidi="id_ID"/>
+          </w:rPr>
+          <w:rPr>
+            <w:color w:val="0000EE"/>
+            <w:u w:val="single"/>
+          </w:rPr>
+          <w:t>Kel. 15:1–18</w:t>
+        </w:r>
+      </w:hyperlink>
+      <w:r>
+        <w:rPr>
+          <w:lang w:val="id_ID" w:bidi="id_ID"/>
+        </w:rPr>
+        <w:t>.</w:t>
+      </w:r>
+      <w:r>
+        <w:rPr>
+          <w:lang w:val="id_ID" w:bidi="id_ID"/>
+        </w:rPr>
+      </w:r>
+      <w:r>
+        <w:rPr>
+          <w:lang w:val="id_ID" w:bidi="id_ID"/>
+        </w:rPr>
+      </w:r>
+    </w:p>
+    <w:p>
+      <w:pPr/>
+      <w:r>
+        <w:rPr>
+          <w:lang w:val="id_ID" w:bidi="id_ID"/>
+        </w:rPr>
+      </w:r>
+    </w:p>
+    <w:p>
+      <w:pPr>
+        <w:pStyle w:val="Heading2"/>
+      </w:pPr>
+      <w:r>
+        <w:rPr>
+          <w:lang w:val="id_ID" w:bidi="id_ID"/>
+        </w:rPr>
+        <w:t>Habakuk 3:11</w:t>
+      </w:r>
+      <w:r>
+        <w:rPr>
+          <w:lang w:val="id_ID" w:bidi="id_ID"/>
+        </w:rPr>
+      </w:r>
+    </w:p>
+    <w:p>
+      <w:pPr/>
+      <w:r>
+        <w:rPr>
+          <w:lang w:val="id_ID" w:bidi="id_ID"/>
+        </w:rPr>
+      </w:r>
+      <w:r>
+        <w:rPr>
+          <w:lang w:val="id_ID" w:bidi="id_ID"/>
+        </w:rPr>
+        <w:t xml:space="preserve">Matahari, bulan: Lihat </w:t>
+      </w:r>
+      <w:hyperlink r:id="rId100">
+        <w:r>
+          <w:rPr>
+            <w:lang w:val="id_ID" w:bidi="id_ID"/>
+          </w:rPr>
+          <w:rPr>
+            <w:color w:val="0000EE"/>
+            <w:u w:val="single"/>
+          </w:rPr>
+          <w:t>Yosua 10:12–13</w:t>
+        </w:r>
+      </w:hyperlink>
+      <w:r>
+        <w:rPr>
+          <w:lang w:val="id_ID" w:bidi="id_ID"/>
+        </w:rPr>
+        <w:t>.</w:t>
+      </w:r>
+      <w:r>
+        <w:rPr>
+          <w:lang w:val="id_ID" w:bidi="id_ID"/>
+        </w:rPr>
+      </w:r>
+      <w:r>
+        <w:rPr>
+          <w:lang w:val="id_ID" w:bidi="id_ID"/>
+        </w:rPr>
+      </w:r>
+    </w:p>
+    <w:p>
+      <w:pPr/>
+      <w:r>
+        <w:rPr>
+          <w:lang w:val="id_ID" w:bidi="id_ID"/>
+        </w:rPr>
+      </w:r>
+    </w:p>
+    <w:p>
+      <w:pPr>
+        <w:pStyle w:val="Heading2"/>
+      </w:pPr>
+      <w:r>
+        <w:rPr>
+          <w:lang w:val="id_ID" w:bidi="id_ID"/>
+        </w:rPr>
+        <w:t>Habakuk 3:15</w:t>
+      </w:r>
+      <w:r>
+        <w:rPr>
+          <w:lang w:val="id_ID" w:bidi="id_ID"/>
+        </w:rPr>
+      </w:r>
+    </w:p>
+    <w:p>
+      <w:pPr/>
+      <w:r>
+        <w:rPr>
+          <w:lang w:val="id_ID" w:bidi="id_ID"/>
+        </w:rPr>
+      </w:r>
+      <w:r>
+        <w:rPr>
+          <w:lang w:val="id_ID" w:bidi="id_ID"/>
+        </w:rPr>
+        <w:t>Laut … air: Bagian ini berakhir sebagaimana saat dimulainya (</w:t>
+      </w:r>
+      <w:hyperlink r:id="rId84">
+        <w:r>
+          <w:rPr>
+            <w:lang w:val="id_ID" w:bidi="id_ID"/>
+          </w:rPr>
+          <w:rPr>
+            <w:color w:val="0000EE"/>
+            <w:u w:val="single"/>
+          </w:rPr>
+          <w:t>Hab.</w:t>
+        </w:r>
+      </w:hyperlink>
+      <w:r>
+        <w:rPr>
+          <w:lang w:val="id_ID" w:bidi="id_ID"/>
+        </w:rPr>
+        <w:t xml:space="preserve"> </w:t>
+      </w:r>
+      <w:hyperlink r:id="rId84">
+        <w:r>
+          <w:rPr>
+            <w:lang w:val="id_ID" w:bidi="id_ID"/>
+          </w:rPr>
+          <w:rPr>
+            <w:color w:val="0000EE"/>
+            <w:u w:val="single"/>
+          </w:rPr>
+          <w:t>3:8</w:t>
+        </w:r>
+      </w:hyperlink>
+      <w:r>
+        <w:rPr>
+          <w:lang w:val="id_ID" w:bidi="id_ID"/>
+        </w:rPr>
+        <w:t>).</w:t>
+      </w:r>
+      <w:r>
+        <w:rPr>
+          <w:lang w:val="id_ID" w:bidi="id_ID"/>
+        </w:rPr>
+      </w:r>
+      <w:r>
+        <w:rPr>
+          <w:lang w:val="id_ID" w:bidi="id_ID"/>
+        </w:rPr>
+      </w:r>
+    </w:p>
+    <w:p>
+      <w:pPr/>
+      <w:r>
+        <w:rPr>
+          <w:lang w:val="id_ID" w:bidi="id_ID"/>
+        </w:rPr>
+      </w:r>
+    </w:p>
+    <w:p>
+      <w:pPr>
+        <w:pStyle w:val="Heading2"/>
+      </w:pPr>
+      <w:r>
+        <w:rPr>
+          <w:lang w:val="id_ID" w:bidi="id_ID"/>
+        </w:rPr>
+        <w:t>Habakuk 3:16</w:t>
+      </w:r>
+      <w:r>
+        <w:rPr>
+          <w:lang w:val="id_ID" w:bidi="id_ID"/>
+        </w:rPr>
+      </w:r>
+    </w:p>
+    <w:p>
+      <w:pPr/>
+      <w:r>
+        <w:rPr>
+          <w:lang w:val="id_ID" w:bidi="id_ID"/>
+        </w:rPr>
+      </w:r>
+      <w:r>
+        <w:rPr>
+          <w:lang w:val="id_ID" w:bidi="id_ID"/>
+        </w:rPr>
+        <w:t xml:space="preserve">Walaupun perwujudan penuh dari kuasa Allah yang besar menguras kekuatan Habakuk sehingga ia gemetar, ia tetap akan menunggu dengan tenang (lihat </w:t>
+      </w:r>
+      <w:hyperlink r:id="rId101">
+        <w:r>
+          <w:rPr>
+            <w:lang w:val="id_ID" w:bidi="id_ID"/>
+          </w:rPr>
+          <w:rPr>
+            <w:color w:val="0000EE"/>
+            <w:u w:val="single"/>
+          </w:rPr>
+          <w:t>Hab.</w:t>
+        </w:r>
+      </w:hyperlink>
+      <w:r>
+        <w:rPr>
+          <w:lang w:val="id_ID" w:bidi="id_ID"/>
+        </w:rPr>
+        <w:t xml:space="preserve"> </w:t>
+      </w:r>
+      <w:hyperlink r:id="rId101">
+        <w:r>
+          <w:rPr>
+            <w:lang w:val="id_ID" w:bidi="id_ID"/>
+          </w:rPr>
+          <w:rPr>
+            <w:color w:val="0000EE"/>
+            <w:u w:val="single"/>
+          </w:rPr>
+          <w:t>2:3</w:t>
+        </w:r>
+      </w:hyperlink>
+      <w:r>
+        <w:rPr>
+          <w:lang w:val="id_ID" w:bidi="id_ID"/>
+        </w:rPr>
+        <w:t>) hingga penghakiman Allah turun.</w:t>
+      </w:r>
+      <w:r>
+        <w:rPr>
+          <w:lang w:val="id_ID" w:bidi="id_ID"/>
+        </w:rPr>
+      </w:r>
+      <w:r>
+        <w:rPr>
+          <w:lang w:val="id_ID" w:bidi="id_ID"/>
+        </w:rPr>
+      </w:r>
+    </w:p>
+    <w:p>
+      <w:pPr/>
+      <w:r>
+        <w:rPr>
+          <w:lang w:val="id_ID" w:bidi="id_ID"/>
+        </w:rPr>
+      </w:r>
+    </w:p>
+    <w:p>
+      <w:pPr>
+        <w:pStyle w:val="Heading2"/>
+      </w:pPr>
+      <w:r>
+        <w:rPr>
+          <w:lang w:val="id_ID" w:bidi="id_ID"/>
+        </w:rPr>
+        <w:t>Habakuk 3:17–19</w:t>
+      </w:r>
+      <w:r>
+        <w:rPr>
+          <w:lang w:val="id_ID" w:bidi="id_ID"/>
+        </w:rPr>
+      </w:r>
+    </w:p>
+    <w:p>
+      <w:pPr/>
+      <w:r>
+        <w:rPr>
+          <w:lang w:val="id_ID" w:bidi="id_ID"/>
+        </w:rPr>
+      </w:r>
+      <w:r>
+        <w:rPr>
+          <w:lang w:val="id_ID" w:bidi="id_ID"/>
+        </w:rPr>
+        <w:t>Setelah menceritakan kembali tindakan-tindakan penebusan Allah yang perkasa (</w:t>
+      </w:r>
+      <w:hyperlink r:id="rId102">
+        <w:r>
+          <w:rPr>
+            <w:lang w:val="id_ID" w:bidi="id_ID"/>
+          </w:rPr>
+          <w:rPr>
+            <w:color w:val="0000EE"/>
+            <w:u w:val="single"/>
+          </w:rPr>
+          <w:t>Hab.</w:t>
+        </w:r>
+      </w:hyperlink>
+      <w:r>
+        <w:rPr>
+          <w:lang w:val="id_ID" w:bidi="id_ID"/>
+        </w:rPr>
+        <w:t xml:space="preserve"> </w:t>
+      </w:r>
+      <w:hyperlink r:id="rId102">
+        <w:r>
+          <w:rPr>
+            <w:lang w:val="id_ID" w:bidi="id_ID"/>
+          </w:rPr>
+          <w:rPr>
+            <w:color w:val="0000EE"/>
+            <w:u w:val="single"/>
+          </w:rPr>
+          <w:t>3:2–15</w:t>
+        </w:r>
+      </w:hyperlink>
+      <w:r>
+        <w:rPr>
+          <w:lang w:val="id_ID" w:bidi="id_ID"/>
+        </w:rPr>
+        <w:t>), dan berhenti sejenak untuk merenungkannya (</w:t>
+      </w:r>
+      <w:hyperlink r:id="rId103">
+        <w:r>
+          <w:rPr>
+            <w:lang w:val="id_ID" w:bidi="id_ID"/>
+          </w:rPr>
+          <w:rPr>
+            <w:color w:val="0000EE"/>
+            <w:u w:val="single"/>
+          </w:rPr>
+          <w:t>Hab.</w:t>
+        </w:r>
+      </w:hyperlink>
+      <w:r>
+        <w:rPr>
+          <w:lang w:val="id_ID" w:bidi="id_ID"/>
+        </w:rPr>
+        <w:t xml:space="preserve"> </w:t>
+      </w:r>
+      <w:hyperlink r:id="rId103">
+        <w:r>
+          <w:rPr>
+            <w:lang w:val="id_ID" w:bidi="id_ID"/>
+          </w:rPr>
+          <w:rPr>
+            <w:color w:val="0000EE"/>
+            <w:u w:val="single"/>
+          </w:rPr>
+          <w:t>3:16</w:t>
+        </w:r>
+      </w:hyperlink>
+      <w:r>
+        <w:rPr>
+          <w:lang w:val="id_ID" w:bidi="id_ID"/>
+        </w:rPr>
+        <w:t>), Habakuk kini menegaskan kembali kepercayaannya kepada Allah saat dia menutup doanya. • Sekalipun . . . namun aku akan bersorak-sorak: Bahkan jika Allah tidak pernah lagi mencurahkan berkat materi kepada umat-Nya, Dia tetap layak mendapatkan semua kepercayaan dan pujian yang dapat mereka berikan. Apapun yang terjadi, nabi bisa bersukacita</w:t>
+      </w:r>
+      <w:r>
+        <w:rPr>
+          <w:i/>
+          <w:lang w:val="id_ID" w:bidi="id_ID"/>
+        </w:rPr>
+        <w:t>,</w:t>
+      </w:r>
+      <w:r>
+        <w:rPr>
+          <w:lang w:val="id_ID" w:bidi="id_ID"/>
+        </w:rPr>
+        <w:t xml:space="preserve"> karena mengetahui bahwa Tuhan bukan hanya Penebus Israel, tetapi juga sumber keselamatan bagi dirinya.</w:t>
+      </w:r>
+      <w:r>
+        <w:rPr>
+          <w:lang w:val="id_ID" w:bidi="id_ID"/>
+        </w:rPr>
+      </w:r>
+      <w:r>
+        <w:rPr>
+          <w:lang w:val="id_ID" w:bidi="id_ID"/>
+        </w:rPr>
+      </w:r>
+    </w:p>
+    <w:p>
+      <w:pPr/>
+      <w:r>
+        <w:rPr>
+          <w:lang w:val="id_ID" w:bidi="id_ID"/>
+        </w:rPr>
+      </w:r>
+    </w:p>
+    <w:p>
+      <w:pPr>
+        <w:pStyle w:val="Heading2"/>
+      </w:pPr>
+      <w:r>
+        <w:rPr>
+          <w:lang w:val="id_ID" w:bidi="id_ID"/>
+        </w:rPr>
+        <w:t>Habakuk 3:19</w:t>
+      </w:r>
+      <w:r>
+        <w:rPr>
+          <w:lang w:val="id_ID" w:bidi="id_ID"/>
+        </w:rPr>
+      </w:r>
+    </w:p>
+    <w:p>
+      <w:pPr/>
+      <w:r>
+        <w:rPr>
+          <w:lang w:val="id_ID" w:bidi="id_ID"/>
+        </w:rPr>
+      </w:r>
+      <w:r>
+        <w:rPr>
+          <w:lang w:val="id_ID" w:bidi="id_ID"/>
+        </w:rPr>
+        <w:t xml:space="preserve">Habakuk mengakui bahwa segala kekuatan yang dimilikinya berasal dari Tuhan Yang Berdaulat, Juruselamatnya (Hab. </w:t>
+      </w:r>
+      <w:hyperlink r:id="rId104">
+        <w:r>
+          <w:rPr>
+            <w:lang w:val="id_ID" w:bidi="id_ID"/>
+          </w:rPr>
+          <w:rPr>
+            <w:color w:val="0000EE"/>
+            <w:u w:val="single"/>
+          </w:rPr>
+          <w:t>3:18</w:t>
+        </w:r>
+      </w:hyperlink>
+      <w:r>
+        <w:rPr>
+          <w:lang w:val="id_ID" w:bidi="id_ID"/>
+        </w:rPr>
+        <w:t xml:space="preserve">). Habakuk mengibaratkan pendakian rohaninya seperti seekor rusa yang dengan cepat mencapai puncak gunung dan meluncur dengan anggun di atasnya (bdk. </w:t>
+      </w:r>
+      <w:hyperlink r:id="rId105">
+        <w:r>
+          <w:rPr>
+            <w:lang w:val="id_ID" w:bidi="id_ID"/>
+          </w:rPr>
+          <w:rPr>
+            <w:color w:val="0000EE"/>
+            <w:u w:val="single"/>
+          </w:rPr>
+          <w:t>Mzm. 18:32–33</w:t>
+        </w:r>
+      </w:hyperlink>
+      <w:r>
+        <w:rPr>
+          <w:lang w:val="id_ID" w:bidi="id_ID"/>
+        </w:rPr>
+        <w:t>).</w:t>
       </w:r>
       <w:r>
         <w:rPr>

</xml_diff>